<commit_message>
Feat: Change st template docx
</commit_message>
<xml_diff>
--- a/oims/templates/docs/st.docx
+++ b/oims/templates/docs/st.docx
@@ -1,6 +1,6 @@
 
 <file path=word/document.xml><?xml version="1.0" encoding="utf-8"?>
-<w:document xmlns:wpc="http://schemas.microsoft.com/office/word/2010/wordprocessingCanvas" xmlns:cx="http://schemas.microsoft.com/office/drawing/2014/chartex" xmlns:cx1="http://schemas.microsoft.com/office/drawing/2015/9/8/chartex" xmlns:cx2="http://schemas.microsoft.com/office/drawing/2015/10/21/chartex" xmlns:cx3="http://schemas.microsoft.com/office/drawing/2016/5/9/chartex" xmlns:cx4="http://schemas.microsoft.com/office/drawing/2016/5/10/chartex" xmlns:cx5="http://schemas.microsoft.com/office/drawing/2016/5/11/chartex" xmlns:cx6="http://schemas.microsoft.com/office/drawing/2016/5/12/chartex" xmlns:cx7="http://schemas.microsoft.com/office/drawing/2016/5/13/chartex" xmlns:cx8="http://schemas.microsoft.com/office/drawing/2016/5/14/chartex" xmlns:mc="http://schemas.openxmlformats.org/markup-compatibility/2006" xmlns:aink="http://schemas.microsoft.com/office/drawing/2016/ink" xmlns:am3d="http://schemas.microsoft.com/office/drawing/2017/model3d" xmlns:o="urn:schemas-microsoft-com:office:office" xmlns:oel="http://schemas.microsoft.com/office/2019/extlst" xmlns:r="http://schemas.openxmlformats.org/officeDocument/2006/relationships" xmlns:m="http://schemas.openxmlformats.org/officeDocument/2006/math" xmlns:v="urn:schemas-microsoft-com:vml" xmlns:wp14="http://schemas.microsoft.com/office/word/2010/wordprocessingDrawing" xmlns:wp="http://schemas.openxmlformats.org/drawingml/2006/wordprocessingDrawing" xmlns:w10="urn:schemas-microsoft-com:office:word" xmlns:w="http://schemas.openxmlformats.org/wordprocessingml/2006/main" xmlns:w14="http://schemas.microsoft.com/office/word/2010/wordml" xmlns:w15="http://schemas.microsoft.com/office/word/2012/wordml" xmlns:w16cex="http://schemas.microsoft.com/office/word/2018/wordml/cex" xmlns:w16cid="http://schemas.microsoft.com/office/word/2016/wordml/cid" xmlns:w16="http://schemas.microsoft.com/office/word/2018/wordml" xmlns:w16du="http://schemas.microsoft.com/office/word/2023/wordml/word16du" xmlns:w16sdtdh="http://schemas.microsoft.com/office/word/2020/wordml/sdtdatahash" xmlns:w16se="http://schemas.microsoft.com/office/word/2015/wordml/symex" xmlns:wpg="http://schemas.microsoft.com/office/word/2010/wordprocessingGroup" xmlns:wpi="http://schemas.microsoft.com/office/word/2010/wordprocessingInk" xmlns:wne="http://schemas.microsoft.com/office/word/2006/wordml" xmlns:wps="http://schemas.microsoft.com/office/word/2010/wordprocessingShape" mc:Ignorable="w14 w15 w16se w16cid w16 w16cex w16sdtdh w16du wp14">
+<w:document xmlns:wpc="http://schemas.microsoft.com/office/word/2010/wordprocessingCanvas" xmlns:cx="http://schemas.microsoft.com/office/drawing/2014/chartex" xmlns:cx1="http://schemas.microsoft.com/office/drawing/2015/9/8/chartex" xmlns:cx2="http://schemas.microsoft.com/office/drawing/2015/10/21/chartex" xmlns:cx3="http://schemas.microsoft.com/office/drawing/2016/5/9/chartex" xmlns:cx4="http://schemas.microsoft.com/office/drawing/2016/5/10/chartex" xmlns:cx5="http://schemas.microsoft.com/office/drawing/2016/5/11/chartex" xmlns:cx6="http://schemas.microsoft.com/office/drawing/2016/5/12/chartex" xmlns:cx7="http://schemas.microsoft.com/office/drawing/2016/5/13/chartex" xmlns:cx8="http://schemas.microsoft.com/office/drawing/2016/5/14/chartex" xmlns:mc="http://schemas.openxmlformats.org/markup-compatibility/2006" xmlns:aink="http://schemas.microsoft.com/office/drawing/2016/ink" xmlns:am3d="http://schemas.microsoft.com/office/drawing/2017/model3d" xmlns:o="urn:schemas-microsoft-com:office:office" xmlns:oel="http://schemas.microsoft.com/office/2019/extlst" xmlns:r="http://schemas.openxmlformats.org/officeDocument/2006/relationships" xmlns:m="http://schemas.openxmlformats.org/officeDocument/2006/math" xmlns:v="urn:schemas-microsoft-com:vml" xmlns:wp14="http://schemas.microsoft.com/office/word/2010/wordprocessingDrawing" xmlns:wp="http://schemas.openxmlformats.org/drawingml/2006/wordprocessingDrawing" xmlns:w10="urn:schemas-microsoft-com:office:word" xmlns:w="http://schemas.openxmlformats.org/wordprocessingml/2006/main" xmlns:w14="http://schemas.microsoft.com/office/word/2010/wordml" xmlns:w15="http://schemas.microsoft.com/office/word/2012/wordml" xmlns:w16cex="http://schemas.microsoft.com/office/word/2018/wordml/cex" xmlns:w16cid="http://schemas.microsoft.com/office/word/2016/wordml/cid" xmlns:w16="http://schemas.microsoft.com/office/word/2018/wordml" xmlns:w16du="http://schemas.microsoft.com/office/word/2023/wordml/word16du" xmlns:w16sdtdh="http://schemas.microsoft.com/office/word/2020/wordml/sdtdatahash" xmlns:w16sdtfl="http://schemas.microsoft.com/office/word/2024/wordml/sdtformatlock" xmlns:w16se="http://schemas.microsoft.com/office/word/2015/wordml/symex" xmlns:wpg="http://schemas.microsoft.com/office/word/2010/wordprocessingGroup" xmlns:wpi="http://schemas.microsoft.com/office/word/2010/wordprocessingInk" xmlns:wne="http://schemas.microsoft.com/office/word/2006/wordml" xmlns:wps="http://schemas.microsoft.com/office/word/2010/wordprocessingShape" mc:Ignorable="w14 w15 w16se w16cid w16 w16cex w16sdtdh w16sdtfl w16du wp14">
   <w:body>
     <w:p>
       <w:pPr>
@@ -55,21 +55,49 @@
           <w:szCs w:val="22"/>
         </w:rPr>
       </w:pPr>
-      <w:r>
-        <w:rPr>
-          <w:rFonts w:ascii="Bookman Old Style" w:hAnsi="Bookman Old Style"/>
-          <w:sz w:val="22"/>
-          <w:szCs w:val="22"/>
-        </w:rPr>
-        <w:t xml:space="preserve">No : </w:t>
-      </w:r>
-      <w:r>
-        <w:rPr>
-          <w:rFonts w:ascii="Bookman Old Style" w:hAnsi="Bookman Old Style"/>
-          <w:sz w:val="22"/>
-          <w:szCs w:val="22"/>
-        </w:rPr>
-        <w:t>{{ no_surat }}</w:t>
+      <w:proofErr w:type="gramStart"/>
+      <w:r>
+        <w:rPr>
+          <w:rFonts w:ascii="Bookman Old Style" w:hAnsi="Bookman Old Style"/>
+          <w:sz w:val="22"/>
+          <w:szCs w:val="22"/>
+        </w:rPr>
+        <w:t>No :</w:t>
+      </w:r>
+      <w:proofErr w:type="gramEnd"/>
+      <w:r>
+        <w:rPr>
+          <w:rFonts w:ascii="Bookman Old Style" w:hAnsi="Bookman Old Style"/>
+          <w:sz w:val="22"/>
+          <w:szCs w:val="22"/>
+        </w:rPr>
+        <w:t xml:space="preserve"> </w:t>
+      </w:r>
+      <w:r>
+        <w:rPr>
+          <w:rFonts w:ascii="Bookman Old Style" w:hAnsi="Bookman Old Style"/>
+          <w:sz w:val="22"/>
+          <w:szCs w:val="22"/>
+        </w:rPr>
+        <w:t xml:space="preserve">{{ </w:t>
+      </w:r>
+      <w:proofErr w:type="spellStart"/>
+      <w:r>
+        <w:rPr>
+          <w:rFonts w:ascii="Bookman Old Style" w:hAnsi="Bookman Old Style"/>
+          <w:sz w:val="22"/>
+          <w:szCs w:val="22"/>
+        </w:rPr>
+        <w:t>no_surat</w:t>
+      </w:r>
+      <w:proofErr w:type="spellEnd"/>
+      <w:r>
+        <w:rPr>
+          <w:rFonts w:ascii="Bookman Old Style" w:hAnsi="Bookman Old Style"/>
+          <w:sz w:val="22"/>
+          <w:szCs w:val="22"/>
+        </w:rPr>
+        <w:t xml:space="preserve"> }}</w:t>
       </w:r>
     </w:p>
     <w:p>
@@ -109,7 +137,79 @@
           <w:sz w:val="22"/>
           <w:szCs w:val="22"/>
         </w:rPr>
-        <w:t>Yang bertanda tangan dibawah ini:</w:t>
+        <w:t xml:space="preserve">Yang </w:t>
+      </w:r>
+      <w:proofErr w:type="spellStart"/>
+      <w:r>
+        <w:rPr>
+          <w:rFonts w:ascii="Bookman Old Style" w:hAnsi="Bookman Old Style"/>
+          <w:sz w:val="22"/>
+          <w:szCs w:val="22"/>
+        </w:rPr>
+        <w:t>bertanda</w:t>
+      </w:r>
+      <w:proofErr w:type="spellEnd"/>
+      <w:r>
+        <w:rPr>
+          <w:rFonts w:ascii="Bookman Old Style" w:hAnsi="Bookman Old Style"/>
+          <w:sz w:val="22"/>
+          <w:szCs w:val="22"/>
+        </w:rPr>
+        <w:t xml:space="preserve"> </w:t>
+      </w:r>
+      <w:proofErr w:type="spellStart"/>
+      <w:r>
+        <w:rPr>
+          <w:rFonts w:ascii="Bookman Old Style" w:hAnsi="Bookman Old Style"/>
+          <w:sz w:val="22"/>
+          <w:szCs w:val="22"/>
+        </w:rPr>
+        <w:t>tangan</w:t>
+      </w:r>
+      <w:proofErr w:type="spellEnd"/>
+      <w:r>
+        <w:rPr>
+          <w:rFonts w:ascii="Bookman Old Style" w:hAnsi="Bookman Old Style"/>
+          <w:sz w:val="22"/>
+          <w:szCs w:val="22"/>
+        </w:rPr>
+        <w:t xml:space="preserve"> </w:t>
+      </w:r>
+      <w:proofErr w:type="spellStart"/>
+      <w:r>
+        <w:rPr>
+          <w:rFonts w:ascii="Bookman Old Style" w:hAnsi="Bookman Old Style"/>
+          <w:sz w:val="22"/>
+          <w:szCs w:val="22"/>
+        </w:rPr>
+        <w:t>dibawah</w:t>
+      </w:r>
+      <w:proofErr w:type="spellEnd"/>
+      <w:r>
+        <w:rPr>
+          <w:rFonts w:ascii="Bookman Old Style" w:hAnsi="Bookman Old Style"/>
+          <w:sz w:val="22"/>
+          <w:szCs w:val="22"/>
+        </w:rPr>
+        <w:t xml:space="preserve"> </w:t>
+      </w:r>
+      <w:proofErr w:type="spellStart"/>
+      <w:r>
+        <w:rPr>
+          <w:rFonts w:ascii="Bookman Old Style" w:hAnsi="Bookman Old Style"/>
+          <w:sz w:val="22"/>
+          <w:szCs w:val="22"/>
+        </w:rPr>
+        <w:t>ini</w:t>
+      </w:r>
+      <w:proofErr w:type="spellEnd"/>
+      <w:r>
+        <w:rPr>
+          <w:rFonts w:ascii="Bookman Old Style" w:hAnsi="Bookman Old Style"/>
+          <w:sz w:val="22"/>
+          <w:szCs w:val="22"/>
+        </w:rPr>
+        <w:t>:</w:t>
       </w:r>
     </w:p>
     <w:p>
@@ -156,13 +256,41 @@
         <w:tab/>
         <w:t xml:space="preserve">: </w:t>
       </w:r>
-      <w:r>
-        <w:rPr>
-          <w:rFonts w:ascii="Bookman Old Style" w:hAnsi="Bookman Old Style"/>
-          <w:sz w:val="22"/>
-          <w:szCs w:val="22"/>
-        </w:rPr>
-        <w:t>{{ nama_penandatangan }}</w:t>
+      <w:proofErr w:type="gramStart"/>
+      <w:r>
+        <w:rPr>
+          <w:rFonts w:ascii="Bookman Old Style" w:hAnsi="Bookman Old Style"/>
+          <w:sz w:val="22"/>
+          <w:szCs w:val="22"/>
+        </w:rPr>
+        <w:t xml:space="preserve">{{ </w:t>
+      </w:r>
+      <w:proofErr w:type="spellStart"/>
+      <w:r>
+        <w:rPr>
+          <w:rFonts w:ascii="Bookman Old Style" w:hAnsi="Bookman Old Style"/>
+          <w:sz w:val="22"/>
+          <w:szCs w:val="22"/>
+        </w:rPr>
+        <w:t>nama</w:t>
+      </w:r>
+      <w:proofErr w:type="gramEnd"/>
+      <w:r>
+        <w:rPr>
+          <w:rFonts w:ascii="Bookman Old Style" w:hAnsi="Bookman Old Style"/>
+          <w:sz w:val="22"/>
+          <w:szCs w:val="22"/>
+        </w:rPr>
+        <w:t>_penandatangan</w:t>
+      </w:r>
+      <w:proofErr w:type="spellEnd"/>
+      <w:r>
+        <w:rPr>
+          <w:rFonts w:ascii="Bookman Old Style" w:hAnsi="Bookman Old Style"/>
+          <w:sz w:val="22"/>
+          <w:szCs w:val="22"/>
+        </w:rPr>
+        <w:t xml:space="preserve"> }}</w:t>
       </w:r>
     </w:p>
     <w:p>
@@ -176,6 +304,7 @@
           <w:szCs w:val="22"/>
         </w:rPr>
       </w:pPr>
+      <w:proofErr w:type="spellStart"/>
       <w:r>
         <w:rPr>
           <w:rFonts w:ascii="Bookman Old Style" w:hAnsi="Bookman Old Style"/>
@@ -184,6 +313,7 @@
         </w:rPr>
         <w:t>Posisi</w:t>
       </w:r>
+      <w:proofErr w:type="spellEnd"/>
       <w:r>
         <w:rPr>
           <w:rFonts w:ascii="Bookman Old Style" w:hAnsi="Bookman Old Style"/>
@@ -210,13 +340,41 @@
         <w:tab/>
         <w:t xml:space="preserve">: </w:t>
       </w:r>
-      <w:r>
-        <w:rPr>
-          <w:rFonts w:ascii="Bookman Old Style" w:hAnsi="Bookman Old Style"/>
-          <w:sz w:val="22"/>
-          <w:szCs w:val="22"/>
-        </w:rPr>
-        <w:t>{{ jabatan_penandatangan }}</w:t>
+      <w:proofErr w:type="gramStart"/>
+      <w:r>
+        <w:rPr>
+          <w:rFonts w:ascii="Bookman Old Style" w:hAnsi="Bookman Old Style"/>
+          <w:sz w:val="22"/>
+          <w:szCs w:val="22"/>
+        </w:rPr>
+        <w:t xml:space="preserve">{{ </w:t>
+      </w:r>
+      <w:proofErr w:type="spellStart"/>
+      <w:r>
+        <w:rPr>
+          <w:rFonts w:ascii="Bookman Old Style" w:hAnsi="Bookman Old Style"/>
+          <w:sz w:val="22"/>
+          <w:szCs w:val="22"/>
+        </w:rPr>
+        <w:t>jabatan</w:t>
+      </w:r>
+      <w:proofErr w:type="gramEnd"/>
+      <w:r>
+        <w:rPr>
+          <w:rFonts w:ascii="Bookman Old Style" w:hAnsi="Bookman Old Style"/>
+          <w:sz w:val="22"/>
+          <w:szCs w:val="22"/>
+        </w:rPr>
+        <w:t>_penandatangan</w:t>
+      </w:r>
+      <w:proofErr w:type="spellEnd"/>
+      <w:r>
+        <w:rPr>
+          <w:rFonts w:ascii="Bookman Old Style" w:hAnsi="Bookman Old Style"/>
+          <w:sz w:val="22"/>
+          <w:szCs w:val="22"/>
+        </w:rPr>
+        <w:t xml:space="preserve"> }}</w:t>
       </w:r>
     </w:p>
     <w:p>
@@ -245,7 +403,43 @@
           <w:szCs w:val="22"/>
         </w:rPr>
         <w:tab/>
-        <w:t>: PT. Orecon Sadanus Perkasa</w:t>
+        <w:t xml:space="preserve">: PT. </w:t>
+      </w:r>
+      <w:proofErr w:type="spellStart"/>
+      <w:r>
+        <w:rPr>
+          <w:rFonts w:ascii="Bookman Old Style" w:hAnsi="Bookman Old Style"/>
+          <w:sz w:val="22"/>
+          <w:szCs w:val="22"/>
+        </w:rPr>
+        <w:t>Orecon</w:t>
+      </w:r>
+      <w:proofErr w:type="spellEnd"/>
+      <w:r>
+        <w:rPr>
+          <w:rFonts w:ascii="Bookman Old Style" w:hAnsi="Bookman Old Style"/>
+          <w:sz w:val="22"/>
+          <w:szCs w:val="22"/>
+        </w:rPr>
+        <w:t xml:space="preserve"> </w:t>
+      </w:r>
+      <w:proofErr w:type="spellStart"/>
+      <w:r>
+        <w:rPr>
+          <w:rFonts w:ascii="Bookman Old Style" w:hAnsi="Bookman Old Style"/>
+          <w:sz w:val="22"/>
+          <w:szCs w:val="22"/>
+        </w:rPr>
+        <w:t>Sadanus</w:t>
+      </w:r>
+      <w:proofErr w:type="spellEnd"/>
+      <w:r>
+        <w:rPr>
+          <w:rFonts w:ascii="Bookman Old Style" w:hAnsi="Bookman Old Style"/>
+          <w:sz w:val="22"/>
+          <w:szCs w:val="22"/>
+        </w:rPr>
+        <w:t xml:space="preserve"> Perkasa</w:t>
       </w:r>
     </w:p>
     <w:p>
@@ -282,7 +476,16 @@
           <w:szCs w:val="22"/>
         </w:rPr>
         <w:tab/>
-        <w:t>: Ruk</w:t>
+        <w:t xml:space="preserve">: </w:t>
+      </w:r>
+      <w:proofErr w:type="spellStart"/>
+      <w:r>
+        <w:rPr>
+          <w:rFonts w:ascii="Bookman Old Style" w:hAnsi="Bookman Old Style"/>
+          <w:sz w:val="22"/>
+          <w:szCs w:val="22"/>
+        </w:rPr>
+        <w:t>Ruk</w:t>
       </w:r>
       <w:r>
         <w:rPr>
@@ -292,6 +495,7 @@
         </w:rPr>
         <w:t>an</w:t>
       </w:r>
+      <w:proofErr w:type="spellEnd"/>
       <w:r>
         <w:rPr>
           <w:rFonts w:ascii="Bookman Old Style" w:hAnsi="Bookman Old Style"/>
@@ -308,7 +512,29 @@
           <w:sz w:val="22"/>
           <w:szCs w:val="22"/>
         </w:rPr>
-        <w:t>Food Plaza Cibubur Country</w:t>
+        <w:t xml:space="preserve">Food Plaza </w:t>
+      </w:r>
+      <w:proofErr w:type="spellStart"/>
+      <w:r>
+        <w:rPr>
+          <w:rFonts w:ascii="Bookman Old Style" w:hAnsi="Bookman Old Style"/>
+          <w:i/>
+          <w:iCs/>
+          <w:sz w:val="22"/>
+          <w:szCs w:val="22"/>
+        </w:rPr>
+        <w:t>Cibubur</w:t>
+      </w:r>
+      <w:proofErr w:type="spellEnd"/>
+      <w:r>
+        <w:rPr>
+          <w:rFonts w:ascii="Bookman Old Style" w:hAnsi="Bookman Old Style"/>
+          <w:i/>
+          <w:iCs/>
+          <w:sz w:val="22"/>
+          <w:szCs w:val="22"/>
+        </w:rPr>
+        <w:t xml:space="preserve"> Country</w:t>
       </w:r>
       <w:r>
         <w:rPr>
@@ -356,15 +582,97 @@
         <w:tab/>
         <w:t xml:space="preserve">  </w:t>
       </w:r>
-      <w:r>
-        <w:rPr>
-          <w:rFonts w:ascii="Bookman Old Style" w:hAnsi="Bookman Old Style"/>
-          <w:sz w:val="22"/>
-          <w:szCs w:val="22"/>
-          <w:lang w:val="sv-SE"/>
-        </w:rPr>
-        <w:t>Cikeas Udik, Gn Putri – Bogor, Jawa Barat 16966</w:t>
-      </w:r>
+      <w:proofErr w:type="spellStart"/>
+      <w:r>
+        <w:rPr>
+          <w:rFonts w:ascii="Bookman Old Style" w:hAnsi="Bookman Old Style"/>
+          <w:sz w:val="22"/>
+          <w:szCs w:val="22"/>
+          <w:lang w:val="sv-SE"/>
+        </w:rPr>
+        <w:t>Cikeas</w:t>
+      </w:r>
+      <w:proofErr w:type="spellEnd"/>
+      <w:r>
+        <w:rPr>
+          <w:rFonts w:ascii="Bookman Old Style" w:hAnsi="Bookman Old Style"/>
+          <w:sz w:val="22"/>
+          <w:szCs w:val="22"/>
+          <w:lang w:val="sv-SE"/>
+        </w:rPr>
+        <w:t xml:space="preserve"> </w:t>
+      </w:r>
+      <w:proofErr w:type="spellStart"/>
+      <w:r>
+        <w:rPr>
+          <w:rFonts w:ascii="Bookman Old Style" w:hAnsi="Bookman Old Style"/>
+          <w:sz w:val="22"/>
+          <w:szCs w:val="22"/>
+          <w:lang w:val="sv-SE"/>
+        </w:rPr>
+        <w:t>Udik</w:t>
+      </w:r>
+      <w:proofErr w:type="spellEnd"/>
+      <w:r>
+        <w:rPr>
+          <w:rFonts w:ascii="Bookman Old Style" w:hAnsi="Bookman Old Style"/>
+          <w:sz w:val="22"/>
+          <w:szCs w:val="22"/>
+          <w:lang w:val="sv-SE"/>
+        </w:rPr>
+        <w:t xml:space="preserve">, </w:t>
+      </w:r>
+      <w:proofErr w:type="spellStart"/>
+      <w:r>
+        <w:rPr>
+          <w:rFonts w:ascii="Bookman Old Style" w:hAnsi="Bookman Old Style"/>
+          <w:sz w:val="22"/>
+          <w:szCs w:val="22"/>
+          <w:lang w:val="sv-SE"/>
+        </w:rPr>
+        <w:t>Gn</w:t>
+      </w:r>
+      <w:proofErr w:type="spellEnd"/>
+      <w:r>
+        <w:rPr>
+          <w:rFonts w:ascii="Bookman Old Style" w:hAnsi="Bookman Old Style"/>
+          <w:sz w:val="22"/>
+          <w:szCs w:val="22"/>
+          <w:lang w:val="sv-SE"/>
+        </w:rPr>
+        <w:t xml:space="preserve"> </w:t>
+      </w:r>
+      <w:proofErr w:type="spellStart"/>
+      <w:r>
+        <w:rPr>
+          <w:rFonts w:ascii="Bookman Old Style" w:hAnsi="Bookman Old Style"/>
+          <w:sz w:val="22"/>
+          <w:szCs w:val="22"/>
+          <w:lang w:val="sv-SE"/>
+        </w:rPr>
+        <w:t>Putri</w:t>
+      </w:r>
+      <w:proofErr w:type="spellEnd"/>
+      <w:r>
+        <w:rPr>
+          <w:rFonts w:ascii="Bookman Old Style" w:hAnsi="Bookman Old Style"/>
+          <w:sz w:val="22"/>
+          <w:szCs w:val="22"/>
+          <w:lang w:val="sv-SE"/>
+        </w:rPr>
+        <w:t xml:space="preserve"> – Bogor, Jawa Barat </w:t>
+      </w:r>
+      <w:proofErr w:type="gramStart"/>
+      <w:r>
+        <w:rPr>
+          <w:rFonts w:ascii="Bookman Old Style" w:hAnsi="Bookman Old Style"/>
+          <w:sz w:val="22"/>
+          <w:szCs w:val="22"/>
+          <w:lang w:val="sv-SE"/>
+        </w:rPr>
+        <w:t>16966</w:t>
+      </w:r>
+      <w:proofErr w:type="gramEnd"/>
     </w:p>
     <w:p>
       <w:pPr>
@@ -389,6 +697,7 @@
           <w:lang w:val="sv-SE"/>
         </w:rPr>
       </w:pPr>
+      <w:proofErr w:type="spellStart"/>
       <w:r>
         <w:rPr>
           <w:rFonts w:ascii="Bookman Old Style" w:eastAsiaTheme="minorHAnsi" w:hAnsi="Bookman Old Style" w:cs="Bookman Old Style"/>
@@ -397,7 +706,62 @@
           <w:szCs w:val="22"/>
           <w:lang w:val="sv-SE" w:eastAsia="en-ID"/>
         </w:rPr>
-        <w:t>Memberikan tugas kepada:</w:t>
+        <w:t>Memberikan</w:t>
+      </w:r>
+      <w:proofErr w:type="spellEnd"/>
+      <w:r>
+        <w:rPr>
+          <w:rFonts w:ascii="Bookman Old Style" w:eastAsiaTheme="minorHAnsi" w:hAnsi="Bookman Old Style" w:cs="Bookman Old Style"/>
+          <w:color w:val="000000"/>
+          <w:sz w:val="22"/>
+          <w:szCs w:val="22"/>
+          <w:lang w:val="sv-SE" w:eastAsia="en-ID"/>
+        </w:rPr>
+        <w:t xml:space="preserve"> </w:t>
+      </w:r>
+      <w:proofErr w:type="spellStart"/>
+      <w:r>
+        <w:rPr>
+          <w:rFonts w:ascii="Bookman Old Style" w:eastAsiaTheme="minorHAnsi" w:hAnsi="Bookman Old Style" w:cs="Bookman Old Style"/>
+          <w:color w:val="000000"/>
+          <w:sz w:val="22"/>
+          <w:szCs w:val="22"/>
+          <w:lang w:val="sv-SE" w:eastAsia="en-ID"/>
+        </w:rPr>
+        <w:t>tugas</w:t>
+      </w:r>
+      <w:proofErr w:type="spellEnd"/>
+      <w:r>
+        <w:rPr>
+          <w:rFonts w:ascii="Bookman Old Style" w:eastAsiaTheme="minorHAnsi" w:hAnsi="Bookman Old Style" w:cs="Bookman Old Style"/>
+          <w:color w:val="000000"/>
+          <w:sz w:val="22"/>
+          <w:szCs w:val="22"/>
+          <w:lang w:val="sv-SE" w:eastAsia="en-ID"/>
+        </w:rPr>
+        <w:t xml:space="preserve"> </w:t>
+      </w:r>
+      <w:proofErr w:type="spellStart"/>
+      <w:r>
+        <w:rPr>
+          <w:rFonts w:ascii="Bookman Old Style" w:eastAsiaTheme="minorHAnsi" w:hAnsi="Bookman Old Style" w:cs="Bookman Old Style"/>
+          <w:color w:val="000000"/>
+          <w:sz w:val="22"/>
+          <w:szCs w:val="22"/>
+          <w:lang w:val="sv-SE" w:eastAsia="en-ID"/>
+        </w:rPr>
+        <w:t>kepada</w:t>
+      </w:r>
+      <w:proofErr w:type="spellEnd"/>
+      <w:r>
+        <w:rPr>
+          <w:rFonts w:ascii="Bookman Old Style" w:eastAsiaTheme="minorHAnsi" w:hAnsi="Bookman Old Style" w:cs="Bookman Old Style"/>
+          <w:color w:val="000000"/>
+          <w:sz w:val="22"/>
+          <w:szCs w:val="22"/>
+          <w:lang w:val="sv-SE" w:eastAsia="en-ID"/>
+        </w:rPr>
+        <w:t>:</w:t>
       </w:r>
     </w:p>
     <w:p>
@@ -414,6 +778,7 @@
           <w:lang w:val="sv-SE"/>
         </w:rPr>
       </w:pPr>
+      <w:proofErr w:type="spellStart"/>
       <w:r>
         <w:rPr>
           <w:rFonts w:ascii="Bookman Old Style" w:hAnsi="Bookman Old Style"/>
@@ -423,6 +788,7 @@
         </w:rPr>
         <w:t>Nama</w:t>
       </w:r>
+      <w:proofErr w:type="spellEnd"/>
       <w:r>
         <w:rPr>
           <w:rFonts w:ascii="Bookman Old Style" w:hAnsi="Bookman Old Style"/>
@@ -459,6 +825,7 @@
         </w:rPr>
         <w:t xml:space="preserve">: </w:t>
       </w:r>
+      <w:proofErr w:type="gramStart"/>
       <w:r>
         <w:rPr>
           <w:rFonts w:ascii="Bookman Old Style" w:hAnsi="Bookman Old Style"/>
@@ -468,7 +835,32 @@
           <w:szCs w:val="22"/>
           <w:lang w:val="sv-SE"/>
         </w:rPr>
-        <w:t>{{ nama }}</w:t>
+        <w:t xml:space="preserve">{{ </w:t>
+      </w:r>
+      <w:proofErr w:type="spellStart"/>
+      <w:r>
+        <w:rPr>
+          <w:rFonts w:ascii="Bookman Old Style" w:hAnsi="Bookman Old Style"/>
+          <w:b/>
+          <w:bCs/>
+          <w:sz w:val="22"/>
+          <w:szCs w:val="22"/>
+          <w:lang w:val="sv-SE"/>
+        </w:rPr>
+        <w:t>nama</w:t>
+      </w:r>
+      <w:proofErr w:type="spellEnd"/>
+      <w:proofErr w:type="gramEnd"/>
+      <w:r>
+        <w:rPr>
+          <w:rFonts w:ascii="Bookman Old Style" w:hAnsi="Bookman Old Style"/>
+          <w:b/>
+          <w:bCs/>
+          <w:sz w:val="22"/>
+          <w:szCs w:val="22"/>
+          <w:lang w:val="sv-SE"/>
+        </w:rPr>
+        <w:t xml:space="preserve"> }}</w:t>
       </w:r>
     </w:p>
     <w:p>
@@ -485,6 +877,7 @@
           <w:lang w:val="sv-SE"/>
         </w:rPr>
       </w:pPr>
+      <w:proofErr w:type="spellStart"/>
       <w:r>
         <w:rPr>
           <w:rFonts w:ascii="Bookman Old Style" w:hAnsi="Bookman Old Style"/>
@@ -494,6 +887,7 @@
         </w:rPr>
         <w:t>Jabatan</w:t>
       </w:r>
+      <w:proofErr w:type="spellEnd"/>
       <w:r>
         <w:rPr>
           <w:rFonts w:ascii="Bookman Old Style" w:hAnsi="Bookman Old Style"/>
@@ -521,6 +915,7 @@
         </w:rPr>
         <w:t xml:space="preserve">: </w:t>
       </w:r>
+      <w:proofErr w:type="gramStart"/>
       <w:r>
         <w:rPr>
           <w:rFonts w:ascii="Bookman Old Style" w:hAnsi="Bookman Old Style"/>
@@ -530,7 +925,32 @@
           <w:szCs w:val="22"/>
           <w:lang w:val="sv-SE"/>
         </w:rPr>
-        <w:t>{{ jabatan }}</w:t>
+        <w:t xml:space="preserve">{{ </w:t>
+      </w:r>
+      <w:proofErr w:type="spellStart"/>
+      <w:r>
+        <w:rPr>
+          <w:rFonts w:ascii="Bookman Old Style" w:hAnsi="Bookman Old Style"/>
+          <w:i/>
+          <w:iCs/>
+          <w:sz w:val="22"/>
+          <w:szCs w:val="22"/>
+          <w:lang w:val="sv-SE"/>
+        </w:rPr>
+        <w:t>jabatan</w:t>
+      </w:r>
+      <w:proofErr w:type="spellEnd"/>
+      <w:proofErr w:type="gramEnd"/>
+      <w:r>
+        <w:rPr>
+          <w:rFonts w:ascii="Bookman Old Style" w:hAnsi="Bookman Old Style"/>
+          <w:i/>
+          <w:iCs/>
+          <w:sz w:val="22"/>
+          <w:szCs w:val="22"/>
+          <w:lang w:val="sv-SE"/>
+        </w:rPr>
+        <w:t xml:space="preserve"> }}</w:t>
       </w:r>
     </w:p>
     <w:p>
@@ -590,14 +1010,33 @@
         </w:rPr>
         <w:t xml:space="preserve">: </w:t>
       </w:r>
-      <w:r>
-        <w:rPr>
-          <w:rFonts w:ascii="Bookman Old Style" w:hAnsi="Bookman Old Style"/>
-          <w:sz w:val="22"/>
-          <w:szCs w:val="22"/>
-          <w:lang w:val="sv-SE"/>
-        </w:rPr>
-        <w:t>{{ nrp }}</w:t>
+      <w:proofErr w:type="gramStart"/>
+      <w:r>
+        <w:rPr>
+          <w:rFonts w:ascii="Bookman Old Style" w:hAnsi="Bookman Old Style"/>
+          <w:sz w:val="22"/>
+          <w:szCs w:val="22"/>
+        </w:rPr>
+        <w:t xml:space="preserve">{{ </w:t>
+      </w:r>
+      <w:proofErr w:type="spellStart"/>
+      <w:r>
+        <w:rPr>
+          <w:rFonts w:ascii="Bookman Old Style" w:hAnsi="Bookman Old Style"/>
+          <w:sz w:val="22"/>
+          <w:szCs w:val="22"/>
+        </w:rPr>
+        <w:t>nrp</w:t>
+      </w:r>
+      <w:proofErr w:type="spellEnd"/>
+      <w:proofErr w:type="gramEnd"/>
+      <w:r>
+        <w:rPr>
+          <w:rFonts w:ascii="Bookman Old Style" w:hAnsi="Bookman Old Style"/>
+          <w:sz w:val="22"/>
+          <w:szCs w:val="22"/>
+        </w:rPr>
+        <w:t xml:space="preserve"> }}</w:t>
       </w:r>
     </w:p>
     <w:p>
@@ -612,6 +1051,7 @@
           <w:lang w:val="sv-SE"/>
         </w:rPr>
       </w:pPr>
+      <w:proofErr w:type="spellStart"/>
       <w:r>
         <w:rPr>
           <w:rFonts w:ascii="Bookman Old Style" w:hAnsi="Bookman Old Style"/>
@@ -621,6 +1061,7 @@
         </w:rPr>
         <w:t>Perusahaan</w:t>
       </w:r>
+      <w:proofErr w:type="spellEnd"/>
       <w:r>
         <w:rPr>
           <w:rFonts w:ascii="Bookman Old Style" w:hAnsi="Bookman Old Style"/>
@@ -646,8 +1087,59 @@
           <w:szCs w:val="22"/>
           <w:lang w:val="sv-SE"/>
         </w:rPr>
-        <w:t>: PT Orecon Sadanus Perkasa</w:t>
-      </w:r>
+        <w:t xml:space="preserve">: PT </w:t>
+      </w:r>
+      <w:proofErr w:type="spellStart"/>
+      <w:r>
+        <w:rPr>
+          <w:rFonts w:ascii="Bookman Old Style" w:hAnsi="Bookman Old Style"/>
+          <w:sz w:val="22"/>
+          <w:szCs w:val="22"/>
+          <w:lang w:val="sv-SE"/>
+        </w:rPr>
+        <w:t>Orecon</w:t>
+      </w:r>
+      <w:proofErr w:type="spellEnd"/>
+      <w:r>
+        <w:rPr>
+          <w:rFonts w:ascii="Bookman Old Style" w:hAnsi="Bookman Old Style"/>
+          <w:sz w:val="22"/>
+          <w:szCs w:val="22"/>
+          <w:lang w:val="sv-SE"/>
+        </w:rPr>
+        <w:t xml:space="preserve"> </w:t>
+      </w:r>
+      <w:proofErr w:type="spellStart"/>
+      <w:r>
+        <w:rPr>
+          <w:rFonts w:ascii="Bookman Old Style" w:hAnsi="Bookman Old Style"/>
+          <w:sz w:val="22"/>
+          <w:szCs w:val="22"/>
+          <w:lang w:val="sv-SE"/>
+        </w:rPr>
+        <w:t>Sadanus</w:t>
+      </w:r>
+      <w:proofErr w:type="spellEnd"/>
+      <w:r>
+        <w:rPr>
+          <w:rFonts w:ascii="Bookman Old Style" w:hAnsi="Bookman Old Style"/>
+          <w:sz w:val="22"/>
+          <w:szCs w:val="22"/>
+          <w:lang w:val="sv-SE"/>
+        </w:rPr>
+        <w:t xml:space="preserve"> </w:t>
+      </w:r>
+      <w:proofErr w:type="spellStart"/>
+      <w:r>
+        <w:rPr>
+          <w:rFonts w:ascii="Bookman Old Style" w:hAnsi="Bookman Old Style"/>
+          <w:sz w:val="22"/>
+          <w:szCs w:val="22"/>
+          <w:lang w:val="sv-SE"/>
+        </w:rPr>
+        <w:t>Perkasa</w:t>
+      </w:r>
+      <w:proofErr w:type="spellEnd"/>
     </w:p>
     <w:p>
       <w:pPr>
@@ -696,6 +1188,7 @@
         <w:tab/>
         <w:t xml:space="preserve">: </w:t>
       </w:r>
+      <w:proofErr w:type="gramStart"/>
       <w:r>
         <w:rPr>
           <w:rFonts w:ascii="Bookman Old Style" w:eastAsiaTheme="minorHAnsi" w:hAnsi="Bookman Old Style"/>
@@ -707,7 +1200,143 @@
           <w:szCs w:val="22"/>
           <w:lang w:eastAsia="en-US"/>
         </w:rPr>
-        <w:t>{{ lokasi_site }}</w:t>
+        <w:t xml:space="preserve">{{ </w:t>
+      </w:r>
+      <w:proofErr w:type="spellStart"/>
+      <w:r>
+        <w:rPr>
+          <w:rFonts w:ascii="Bookman Old Style" w:eastAsiaTheme="minorHAnsi" w:hAnsi="Bookman Old Style"/>
+          <w:b/>
+          <w:bCs/>
+          <w:i/>
+          <w:iCs/>
+          <w:sz w:val="22"/>
+          <w:szCs w:val="22"/>
+          <w:lang w:eastAsia="en-US"/>
+        </w:rPr>
+        <w:t>lokasi</w:t>
+      </w:r>
+      <w:proofErr w:type="gramEnd"/>
+      <w:r>
+        <w:rPr>
+          <w:rFonts w:ascii="Bookman Old Style" w:eastAsiaTheme="minorHAnsi" w:hAnsi="Bookman Old Style"/>
+          <w:b/>
+          <w:bCs/>
+          <w:i/>
+          <w:iCs/>
+          <w:sz w:val="22"/>
+          <w:szCs w:val="22"/>
+          <w:lang w:eastAsia="en-US"/>
+        </w:rPr>
+        <w:t>_site</w:t>
+      </w:r>
+      <w:proofErr w:type="spellEnd"/>
+      <w:r>
+        <w:rPr>
+          <w:rFonts w:ascii="Bookman Old Style" w:eastAsiaTheme="minorHAnsi" w:hAnsi="Bookman Old Style"/>
+          <w:b/>
+          <w:bCs/>
+          <w:i/>
+          <w:iCs/>
+          <w:sz w:val="22"/>
+          <w:szCs w:val="22"/>
+          <w:lang w:eastAsia="en-US"/>
+        </w:rPr>
+        <w:t xml:space="preserve"> }}</w:t>
+      </w:r>
+    </w:p>
+    <w:p>
+      <w:pPr>
+        <w:spacing w:line="276" w:lineRule="auto"/>
+        <w:ind w:firstLine="720"/>
+        <w:jc w:val="both"/>
+        <w:rPr>
+          <w:rFonts w:ascii="Bookman Old Style" w:eastAsiaTheme="minorHAnsi" w:hAnsi="Bookman Old Style"/>
+          <w:sz w:val="22"/>
+          <w:szCs w:val="22"/>
+          <w:lang w:val="sv-SE" w:eastAsia="en-US"/>
+        </w:rPr>
+      </w:pPr>
+      <w:proofErr w:type="spellStart"/>
+      <w:r>
+        <w:rPr>
+          <w:rFonts w:ascii="Bookman Old Style" w:hAnsi="Bookman Old Style"/>
+          <w:sz w:val="22"/>
+          <w:szCs w:val="22"/>
+          <w:lang w:val="sv-SE"/>
+        </w:rPr>
+        <w:t>Tanggal</w:t>
+      </w:r>
+      <w:proofErr w:type="spellEnd"/>
+      <w:r>
+        <w:rPr>
+          <w:rFonts w:ascii="Bookman Old Style" w:hAnsi="Bookman Old Style"/>
+          <w:sz w:val="22"/>
+          <w:szCs w:val="22"/>
+          <w:lang w:val="sv-SE"/>
+        </w:rPr>
+        <w:t xml:space="preserve"> </w:t>
+      </w:r>
+      <w:proofErr w:type="spellStart"/>
+      <w:r>
+        <w:rPr>
+          <w:rFonts w:ascii="Bookman Old Style" w:hAnsi="Bookman Old Style"/>
+          <w:sz w:val="22"/>
+          <w:szCs w:val="22"/>
+          <w:lang w:val="sv-SE"/>
+        </w:rPr>
+        <w:t>Berangkat</w:t>
+      </w:r>
+      <w:proofErr w:type="spellEnd"/>
+      <w:r>
+        <w:rPr>
+          <w:rFonts w:ascii="Bookman Old Style" w:hAnsi="Bookman Old Style"/>
+          <w:sz w:val="22"/>
+          <w:szCs w:val="22"/>
+          <w:lang w:val="sv-SE"/>
+        </w:rPr>
+        <w:tab/>
+        <w:t xml:space="preserve">: </w:t>
+      </w:r>
+      <w:proofErr w:type="gramStart"/>
+      <w:r>
+        <w:rPr>
+          <w:rFonts w:ascii="Bookman Old Style" w:hAnsi="Bookman Old Style"/>
+          <w:sz w:val="22"/>
+          <w:szCs w:val="22"/>
+          <w:lang w:val="sv-SE"/>
+        </w:rPr>
+        <w:t xml:space="preserve">{{ </w:t>
+      </w:r>
+      <w:proofErr w:type="spellStart"/>
+      <w:r>
+        <w:rPr>
+          <w:rFonts w:ascii="Bookman Old Style" w:hAnsi="Bookman Old Style"/>
+          <w:sz w:val="22"/>
+          <w:szCs w:val="22"/>
+          <w:lang w:val="sv-SE"/>
+        </w:rPr>
+        <w:t>tanggal</w:t>
+      </w:r>
+      <w:proofErr w:type="gramEnd"/>
+      <w:r>
+        <w:rPr>
+          <w:rFonts w:ascii="Bookman Old Style" w:hAnsi="Bookman Old Style"/>
+          <w:sz w:val="22"/>
+          <w:szCs w:val="22"/>
+          <w:lang w:val="sv-SE"/>
+        </w:rPr>
+        <w:t>_berangkat</w:t>
+      </w:r>
+      <w:proofErr w:type="spellEnd"/>
+      <w:r>
+        <w:rPr>
+          <w:rFonts w:ascii="Bookman Old Style" w:hAnsi="Bookman Old Style"/>
+          <w:sz w:val="22"/>
+          <w:szCs w:val="22"/>
+          <w:lang w:val="sv-SE"/>
+        </w:rPr>
+        <w:t xml:space="preserve"> }}</w:t>
       </w:r>
     </w:p>
     <w:p>
@@ -722,6 +1351,7 @@
           <w:lang w:val="sv-SE" w:eastAsia="en-US"/>
         </w:rPr>
       </w:pPr>
+      <w:proofErr w:type="spellStart"/>
       <w:r>
         <w:rPr>
           <w:rFonts w:ascii="Bookman Old Style" w:eastAsiaTheme="minorHAnsi" w:hAnsi="Bookman Old Style"/>
@@ -729,8 +1359,9 @@
           <w:szCs w:val="22"/>
           <w:lang w:val="sv-SE" w:eastAsia="en-US"/>
         </w:rPr>
-        <w:t>Keperluan</w:t>
-      </w:r>
+        <w:t>Tanggal</w:t>
+      </w:r>
+      <w:proofErr w:type="spellEnd"/>
       <w:r>
         <w:rPr>
           <w:rFonts w:ascii="Bookman Old Style" w:eastAsiaTheme="minorHAnsi" w:hAnsi="Bookman Old Style"/>
@@ -738,8 +1369,9 @@
           <w:szCs w:val="22"/>
           <w:lang w:val="sv-SE" w:eastAsia="en-US"/>
         </w:rPr>
-        <w:tab/>
-      </w:r>
+        <w:t xml:space="preserve"> </w:t>
+      </w:r>
+      <w:proofErr w:type="spellStart"/>
       <w:r>
         <w:rPr>
           <w:rFonts w:ascii="Bookman Old Style" w:eastAsiaTheme="minorHAnsi" w:hAnsi="Bookman Old Style"/>
@@ -747,82 +1379,56 @@
           <w:szCs w:val="22"/>
           <w:lang w:val="sv-SE" w:eastAsia="en-US"/>
         </w:rPr>
-        <w:t xml:space="preserve">: </w:t>
-      </w:r>
+        <w:t>Kembali</w:t>
+      </w:r>
+      <w:proofErr w:type="spellEnd"/>
       <w:r>
         <w:rPr>
           <w:rFonts w:ascii="Bookman Old Style" w:eastAsiaTheme="minorHAnsi" w:hAnsi="Bookman Old Style"/>
           <w:sz w:val="22"/>
           <w:szCs w:val="22"/>
           <w:lang w:val="sv-SE" w:eastAsia="en-US"/>
-        </w:rPr>
-        <w:t>{{ keperluan }}</w:t>
-      </w:r>
-    </w:p>
-    <w:p>
-      <w:pPr>
-        <w:spacing w:line="276" w:lineRule="auto"/>
-        <w:ind w:firstLine="720"/>
-        <w:jc w:val="both"/>
-        <w:rPr>
-          <w:rFonts w:ascii="Bookman Old Style" w:eastAsiaTheme="minorHAnsi" w:hAnsi="Bookman Old Style"/>
-          <w:sz w:val="22"/>
-          <w:szCs w:val="22"/>
-          <w:lang w:val="sv-SE" w:eastAsia="en-US"/>
-        </w:rPr>
-      </w:pPr>
-      <w:r>
-        <w:rPr>
-          <w:rFonts w:ascii="Bookman Old Style" w:hAnsi="Bookman Old Style"/>
-          <w:sz w:val="22"/>
-          <w:szCs w:val="22"/>
-          <w:lang w:val="sv-SE"/>
-        </w:rPr>
-        <w:t>Tanggal</w:t>
-      </w:r>
-      <w:r>
-        <w:rPr>
-          <w:rFonts w:ascii="Bookman Old Style" w:hAnsi="Bookman Old Style"/>
-          <w:sz w:val="22"/>
-          <w:szCs w:val="22"/>
-          <w:lang w:val="sv-SE"/>
-        </w:rPr>
-        <w:t xml:space="preserve"> Berangkat</w:t>
-      </w:r>
-      <w:r>
-        <w:rPr>
-          <w:rFonts w:ascii="Bookman Old Style" w:hAnsi="Bookman Old Style"/>
-          <w:sz w:val="22"/>
-          <w:szCs w:val="22"/>
-          <w:lang w:val="sv-SE"/>
         </w:rPr>
         <w:tab/>
         <w:t xml:space="preserve">: </w:t>
       </w:r>
-      <w:r>
-        <w:rPr>
-          <w:rFonts w:ascii="Bookman Old Style" w:hAnsi="Bookman Old Style"/>
-          <w:sz w:val="22"/>
-          <w:szCs w:val="22"/>
-          <w:lang w:val="sv-SE"/>
-        </w:rPr>
-        <w:t>{{ t</w:t>
-      </w:r>
-      <w:r>
-        <w:rPr>
-          <w:rFonts w:ascii="Bookman Old Style" w:hAnsi="Bookman Old Style"/>
-          <w:sz w:val="22"/>
-          <w:szCs w:val="22"/>
-          <w:lang w:val="sv-SE"/>
-        </w:rPr>
-        <w:t>anggal_berangkat</w:t>
-      </w:r>
-      <w:r>
-        <w:rPr>
-          <w:rFonts w:ascii="Bookman Old Style" w:hAnsi="Bookman Old Style"/>
-          <w:sz w:val="22"/>
-          <w:szCs w:val="22"/>
-          <w:lang w:val="sv-SE"/>
+      <w:proofErr w:type="gramStart"/>
+      <w:r>
+        <w:rPr>
+          <w:rFonts w:ascii="Bookman Old Style" w:eastAsiaTheme="minorHAnsi" w:hAnsi="Bookman Old Style"/>
+          <w:sz w:val="22"/>
+          <w:szCs w:val="22"/>
+          <w:lang w:val="sv-SE" w:eastAsia="en-US"/>
+        </w:rPr>
+        <w:t xml:space="preserve">{{ </w:t>
+      </w:r>
+      <w:proofErr w:type="spellStart"/>
+      <w:r>
+        <w:rPr>
+          <w:rFonts w:ascii="Bookman Old Style" w:eastAsiaTheme="minorHAnsi" w:hAnsi="Bookman Old Style"/>
+          <w:sz w:val="22"/>
+          <w:szCs w:val="22"/>
+          <w:lang w:val="sv-SE" w:eastAsia="en-US"/>
+        </w:rPr>
+        <w:t>tanggal</w:t>
+      </w:r>
+      <w:proofErr w:type="gramEnd"/>
+      <w:r>
+        <w:rPr>
+          <w:rFonts w:ascii="Bookman Old Style" w:eastAsiaTheme="minorHAnsi" w:hAnsi="Bookman Old Style"/>
+          <w:sz w:val="22"/>
+          <w:szCs w:val="22"/>
+          <w:lang w:val="sv-SE" w:eastAsia="en-US"/>
+        </w:rPr>
+        <w:t>_pulang</w:t>
+      </w:r>
+      <w:proofErr w:type="spellEnd"/>
+      <w:r>
+        <w:rPr>
+          <w:rFonts w:ascii="Bookman Old Style" w:eastAsiaTheme="minorHAnsi" w:hAnsi="Bookman Old Style"/>
+          <w:sz w:val="22"/>
+          <w:szCs w:val="22"/>
+          <w:lang w:val="sv-SE" w:eastAsia="en-US"/>
         </w:rPr>
         <w:t xml:space="preserve"> }}</w:t>
       </w:r>
@@ -833,65 +1439,6 @@
         <w:ind w:left="2880" w:hanging="2160"/>
         <w:jc w:val="both"/>
         <w:rPr>
-          <w:rFonts w:ascii="Bookman Old Style" w:eastAsiaTheme="minorHAnsi" w:hAnsi="Bookman Old Style"/>
-          <w:sz w:val="22"/>
-          <w:szCs w:val="22"/>
-          <w:lang w:val="sv-SE" w:eastAsia="en-US"/>
-        </w:rPr>
-      </w:pPr>
-      <w:r>
-        <w:rPr>
-          <w:rFonts w:ascii="Bookman Old Style" w:eastAsiaTheme="minorHAnsi" w:hAnsi="Bookman Old Style"/>
-          <w:sz w:val="22"/>
-          <w:szCs w:val="22"/>
-          <w:lang w:val="sv-SE" w:eastAsia="en-US"/>
-        </w:rPr>
-        <w:t>Tanggal Kembali</w:t>
-      </w:r>
-      <w:r>
-        <w:rPr>
-          <w:rFonts w:ascii="Bookman Old Style" w:eastAsiaTheme="minorHAnsi" w:hAnsi="Bookman Old Style"/>
-          <w:sz w:val="22"/>
-          <w:szCs w:val="22"/>
-          <w:lang w:val="sv-SE" w:eastAsia="en-US"/>
-        </w:rPr>
-        <w:tab/>
-        <w:t xml:space="preserve">: </w:t>
-      </w:r>
-      <w:r>
-        <w:rPr>
-          <w:rFonts w:ascii="Bookman Old Style" w:eastAsiaTheme="minorHAnsi" w:hAnsi="Bookman Old Style"/>
-          <w:sz w:val="22"/>
-          <w:szCs w:val="22"/>
-          <w:lang w:val="sv-SE" w:eastAsia="en-US"/>
-        </w:rPr>
-        <w:t>{{ t</w:t>
-      </w:r>
-      <w:r>
-        <w:rPr>
-          <w:rFonts w:ascii="Bookman Old Style" w:eastAsiaTheme="minorHAnsi" w:hAnsi="Bookman Old Style"/>
-          <w:sz w:val="22"/>
-          <w:szCs w:val="22"/>
-          <w:lang w:val="sv-SE" w:eastAsia="en-US"/>
-        </w:rPr>
-        <w:t>anggal_pulang</w:t>
-      </w:r>
-      <w:r>
-        <w:rPr>
-          <w:rFonts w:ascii="Bookman Old Style" w:eastAsiaTheme="minorHAnsi" w:hAnsi="Bookman Old Style"/>
-          <w:sz w:val="22"/>
-          <w:szCs w:val="22"/>
-          <w:lang w:val="sv-SE" w:eastAsia="en-US"/>
-        </w:rPr>
-        <w:t xml:space="preserve"> }}</w:t>
-      </w:r>
-    </w:p>
-    <w:p>
-      <w:pPr>
-        <w:spacing w:line="276" w:lineRule="auto"/>
-        <w:ind w:left="2880" w:hanging="2160"/>
-        <w:jc w:val="both"/>
-        <w:rPr>
           <w:rFonts w:ascii="Bookman Old Style" w:hAnsi="Bookman Old Style"/>
           <w:sz w:val="22"/>
           <w:szCs w:val="22"/>
@@ -984,6 +1531,7 @@
         </w:rPr>
         <w:t xml:space="preserve">, </w:t>
       </w:r>
+      <w:proofErr w:type="gramStart"/>
       <w:r>
         <w:rPr>
           <w:rFonts w:ascii="Bookman Old Style" w:eastAsiaTheme="minorHAnsi" w:hAnsi="Bookman Old Style"/>
@@ -991,7 +1539,28 @@
           <w:szCs w:val="22"/>
           <w:lang w:val="sv-SE" w:eastAsia="en-US"/>
         </w:rPr>
-        <w:t>{{ tanggal }}</w:t>
+        <w:t xml:space="preserve">{{ </w:t>
+      </w:r>
+      <w:proofErr w:type="spellStart"/>
+      <w:r>
+        <w:rPr>
+          <w:rFonts w:ascii="Bookman Old Style" w:eastAsiaTheme="minorHAnsi" w:hAnsi="Bookman Old Style"/>
+          <w:sz w:val="22"/>
+          <w:szCs w:val="22"/>
+          <w:lang w:val="sv-SE" w:eastAsia="en-US"/>
+        </w:rPr>
+        <w:t>tanggal</w:t>
+      </w:r>
+      <w:proofErr w:type="spellEnd"/>
+      <w:proofErr w:type="gramEnd"/>
+      <w:r>
+        <w:rPr>
+          <w:rFonts w:ascii="Bookman Old Style" w:eastAsiaTheme="minorHAnsi" w:hAnsi="Bookman Old Style"/>
+          <w:sz w:val="22"/>
+          <w:szCs w:val="22"/>
+          <w:lang w:val="sv-SE" w:eastAsia="en-US"/>
+        </w:rPr>
+        <w:t xml:space="preserve"> }}</w:t>
       </w:r>
     </w:p>
     <w:p>
@@ -1006,6 +1575,7 @@
           <w:lang w:val="sv-SE" w:eastAsia="en-US"/>
         </w:rPr>
       </w:pPr>
+      <w:proofErr w:type="spellStart"/>
       <w:r>
         <w:rPr>
           <w:rFonts w:ascii="Bookman Old Style" w:eastAsiaTheme="minorHAnsi" w:hAnsi="Bookman Old Style"/>
@@ -1013,7 +1583,17 @@
           <w:szCs w:val="22"/>
           <w:lang w:val="sv-SE" w:eastAsia="en-US"/>
         </w:rPr>
-        <w:t xml:space="preserve">Menyetujui, </w:t>
+        <w:t>Menyetujui</w:t>
+      </w:r>
+      <w:proofErr w:type="spellEnd"/>
+      <w:r>
+        <w:rPr>
+          <w:rFonts w:ascii="Bookman Old Style" w:eastAsiaTheme="minorHAnsi" w:hAnsi="Bookman Old Style"/>
+          <w:sz w:val="22"/>
+          <w:szCs w:val="22"/>
+          <w:lang w:val="sv-SE" w:eastAsia="en-US"/>
+        </w:rPr>
+        <w:t xml:space="preserve">, </w:t>
       </w:r>
     </w:p>
     <w:p>
@@ -1039,8 +1619,69 @@
           <w:szCs w:val="22"/>
           <w:lang w:val="sv-SE" w:eastAsia="en-US"/>
         </w:rPr>
-        <w:t>PT. Orecon Sadanus Perkasa</w:t>
-      </w:r>
+        <w:t xml:space="preserve">PT. </w:t>
+      </w:r>
+      <w:proofErr w:type="spellStart"/>
+      <w:r>
+        <w:rPr>
+          <w:rFonts w:ascii="Bookman Old Style" w:eastAsiaTheme="minorHAnsi" w:hAnsi="Bookman Old Style"/>
+          <w:b/>
+          <w:bCs/>
+          <w:sz w:val="22"/>
+          <w:szCs w:val="22"/>
+          <w:lang w:val="sv-SE" w:eastAsia="en-US"/>
+        </w:rPr>
+        <w:t>Orecon</w:t>
+      </w:r>
+      <w:proofErr w:type="spellEnd"/>
+      <w:r>
+        <w:rPr>
+          <w:rFonts w:ascii="Bookman Old Style" w:eastAsiaTheme="minorHAnsi" w:hAnsi="Bookman Old Style"/>
+          <w:b/>
+          <w:bCs/>
+          <w:sz w:val="22"/>
+          <w:szCs w:val="22"/>
+          <w:lang w:val="sv-SE" w:eastAsia="en-US"/>
+        </w:rPr>
+        <w:t xml:space="preserve"> </w:t>
+      </w:r>
+      <w:proofErr w:type="spellStart"/>
+      <w:r>
+        <w:rPr>
+          <w:rFonts w:ascii="Bookman Old Style" w:eastAsiaTheme="minorHAnsi" w:hAnsi="Bookman Old Style"/>
+          <w:b/>
+          <w:bCs/>
+          <w:sz w:val="22"/>
+          <w:szCs w:val="22"/>
+          <w:lang w:val="sv-SE" w:eastAsia="en-US"/>
+        </w:rPr>
+        <w:t>Sadanus</w:t>
+      </w:r>
+      <w:proofErr w:type="spellEnd"/>
+      <w:r>
+        <w:rPr>
+          <w:rFonts w:ascii="Bookman Old Style" w:eastAsiaTheme="minorHAnsi" w:hAnsi="Bookman Old Style"/>
+          <w:b/>
+          <w:bCs/>
+          <w:sz w:val="22"/>
+          <w:szCs w:val="22"/>
+          <w:lang w:val="sv-SE" w:eastAsia="en-US"/>
+        </w:rPr>
+        <w:t xml:space="preserve"> </w:t>
+      </w:r>
+      <w:proofErr w:type="spellStart"/>
+      <w:r>
+        <w:rPr>
+          <w:rFonts w:ascii="Bookman Old Style" w:eastAsiaTheme="minorHAnsi" w:hAnsi="Bookman Old Style"/>
+          <w:b/>
+          <w:bCs/>
+          <w:sz w:val="22"/>
+          <w:szCs w:val="22"/>
+          <w:lang w:val="sv-SE" w:eastAsia="en-US"/>
+        </w:rPr>
+        <w:t>Perkasa</w:t>
+      </w:r>
+      <w:proofErr w:type="spellEnd"/>
     </w:p>
     <w:p>
       <w:pPr>
@@ -1063,7 +1704,29 @@
           <w:szCs w:val="22"/>
           <w:lang w:val="sv-SE" w:eastAsia="en-US"/>
         </w:rPr>
-        <w:t>${ttd}</w:t>
+        <w:t>${</w:t>
+      </w:r>
+      <w:proofErr w:type="spellStart"/>
+      <w:r>
+        <w:rPr>
+          <w:rFonts w:ascii="Bookman Old Style" w:eastAsiaTheme="minorHAnsi" w:hAnsi="Bookman Old Style"/>
+          <w:color w:val="FFFFFF" w:themeColor="background1"/>
+          <w:sz w:val="22"/>
+          <w:szCs w:val="22"/>
+          <w:lang w:val="sv-SE" w:eastAsia="en-US"/>
+        </w:rPr>
+        <w:t>ttd</w:t>
+      </w:r>
+      <w:proofErr w:type="spellEnd"/>
+      <w:r>
+        <w:rPr>
+          <w:rFonts w:ascii="Bookman Old Style" w:eastAsiaTheme="minorHAnsi" w:hAnsi="Bookman Old Style"/>
+          <w:color w:val="FFFFFF" w:themeColor="background1"/>
+          <w:sz w:val="22"/>
+          <w:szCs w:val="22"/>
+          <w:lang w:val="sv-SE" w:eastAsia="en-US"/>
+        </w:rPr>
+        <w:t>}</w:t>
       </w:r>
     </w:p>
     <w:p>
@@ -1109,6 +1772,7 @@
           <w:lang w:eastAsia="en-US"/>
         </w:rPr>
       </w:pPr>
+      <w:proofErr w:type="gramStart"/>
       <w:r>
         <w:rPr>
           <w:rFonts w:ascii="Bookman Old Style" w:eastAsiaTheme="minorHAnsi" w:hAnsi="Bookman Old Style"/>
@@ -1119,7 +1783,46 @@
           <w:u w:val="single"/>
           <w:lang w:eastAsia="en-US"/>
         </w:rPr>
-        <w:t>{{ nama_penandatangan }}</w:t>
+        <w:t xml:space="preserve">{{ </w:t>
+      </w:r>
+      <w:proofErr w:type="spellStart"/>
+      <w:r>
+        <w:rPr>
+          <w:rFonts w:ascii="Bookman Old Style" w:eastAsiaTheme="minorHAnsi" w:hAnsi="Bookman Old Style"/>
+          <w:b/>
+          <w:bCs/>
+          <w:sz w:val="22"/>
+          <w:szCs w:val="22"/>
+          <w:u w:val="single"/>
+          <w:lang w:eastAsia="en-US"/>
+        </w:rPr>
+        <w:t>nama</w:t>
+      </w:r>
+      <w:proofErr w:type="gramEnd"/>
+      <w:r>
+        <w:rPr>
+          <w:rFonts w:ascii="Bookman Old Style" w:eastAsiaTheme="minorHAnsi" w:hAnsi="Bookman Old Style"/>
+          <w:b/>
+          <w:bCs/>
+          <w:sz w:val="22"/>
+          <w:szCs w:val="22"/>
+          <w:u w:val="single"/>
+          <w:lang w:eastAsia="en-US"/>
+        </w:rPr>
+        <w:t>_penandatangan</w:t>
+      </w:r>
+      <w:proofErr w:type="spellEnd"/>
+      <w:r>
+        <w:rPr>
+          <w:rFonts w:ascii="Bookman Old Style" w:eastAsiaTheme="minorHAnsi" w:hAnsi="Bookman Old Style"/>
+          <w:b/>
+          <w:bCs/>
+          <w:sz w:val="22"/>
+          <w:szCs w:val="22"/>
+          <w:u w:val="single"/>
+          <w:lang w:eastAsia="en-US"/>
+        </w:rPr>
+        <w:t xml:space="preserve"> }}</w:t>
       </w:r>
     </w:p>
     <w:p>
@@ -1143,7 +1846,7 @@
           <w:lang w:eastAsia="en-US"/>
         </w:rPr>
         <w:drawing>
-          <wp:anchor distT="0" distB="0" distL="114300" distR="114300" simplePos="0" relativeHeight="251657216" behindDoc="0" locked="0" layoutInCell="1" allowOverlap="1" wp14:anchorId="02928FBC" wp14:editId="2DE7C69F">
+          <wp:anchor distT="0" distB="0" distL="114300" distR="114300" simplePos="0" relativeHeight="251657216" behindDoc="0" locked="0" layoutInCell="1" allowOverlap="1" wp14:anchorId="4A10D353" wp14:editId="7BAE1E82">
             <wp:simplePos x="0" y="0"/>
             <wp:positionH relativeFrom="column">
               <wp:posOffset>-4393777</wp:posOffset>
@@ -1154,7 +1857,7 @@
             <wp:extent cx="1869047" cy="3060725"/>
             <wp:effectExtent l="590550" t="0" r="569595" b="0"/>
             <wp:wrapNone/>
-            <wp:docPr id="3" name="Picture 3"/>
+            <wp:docPr id="1001" name="Picture 3"/>
             <wp:cNvGraphicFramePr>
               <a:graphicFrameLocks xmlns:a="http://schemas.openxmlformats.org/drawingml/2006/main" noChangeAspect="1"/>
             </wp:cNvGraphicFramePr>
@@ -1205,6 +1908,7 @@
           </wp:anchor>
         </w:drawing>
       </w:r>
+      <w:proofErr w:type="gramStart"/>
       <w:r>
         <w:rPr>
           <w:rFonts w:ascii="Bookman Old Style" w:eastAsiaTheme="minorHAnsi" w:hAnsi="Bookman Old Style"/>
@@ -1212,28 +1916,38 @@
           <w:szCs w:val="22"/>
           <w:lang w:eastAsia="en-US"/>
         </w:rPr>
-        <w:t>{{ jabatan_penandatangan }}</w:t>
-      </w:r>
-    </w:p>
-    <w:p>
-      <w:pPr>
+        <w:t xml:space="preserve">{{ </w:t>
+      </w:r>
+      <w:proofErr w:type="spellStart"/>
+      <w:r>
         <w:rPr>
           <w:rFonts w:ascii="Bookman Old Style" w:eastAsiaTheme="minorHAnsi" w:hAnsi="Bookman Old Style"/>
           <w:sz w:val="22"/>
           <w:szCs w:val="22"/>
           <w:lang w:eastAsia="en-US"/>
         </w:rPr>
-      </w:pPr>
-    </w:p>
-    <w:p>
-      <w:pPr>
+        <w:t>jabatan</w:t>
+      </w:r>
+      <w:proofErr w:type="gramEnd"/>
+      <w:r>
         <w:rPr>
           <w:rFonts w:ascii="Bookman Old Style" w:eastAsiaTheme="minorHAnsi" w:hAnsi="Bookman Old Style"/>
           <w:sz w:val="22"/>
           <w:szCs w:val="22"/>
           <w:lang w:eastAsia="en-US"/>
         </w:rPr>
-      </w:pPr>
+        <w:t>_penandatangan</w:t>
+      </w:r>
+      <w:proofErr w:type="spellEnd"/>
+      <w:r>
+        <w:rPr>
+          <w:rFonts w:ascii="Bookman Old Style" w:eastAsiaTheme="minorHAnsi" w:hAnsi="Bookman Old Style"/>
+          <w:sz w:val="22"/>
+          <w:szCs w:val="22"/>
+          <w:lang w:eastAsia="en-US"/>
+        </w:rPr>
+        <w:t xml:space="preserve"> }}</w:t>
+      </w:r>
     </w:p>
     <w:p>
       <w:pPr>
@@ -1254,6 +1968,19 @@
         </w:rPr>
         <w:br w:type="page"/>
       </w:r>
+    </w:p>
+    <w:p>
+      <w:pPr>
+        <w:suppressAutoHyphens w:val="0"/>
+        <w:spacing w:after="160" w:line="276" w:lineRule="auto"/>
+        <w:jc w:val="both"/>
+        <w:rPr>
+          <w:rFonts w:ascii="Bookman Old Style" w:eastAsiaTheme="minorHAnsi" w:hAnsi="Bookman Old Style"/>
+          <w:sz w:val="22"/>
+          <w:szCs w:val="22"/>
+          <w:lang w:eastAsia="en-US"/>
+        </w:rPr>
+      </w:pPr>
     </w:p>
     <w:p>
       <w:pPr>
@@ -1296,6 +2023,7 @@
                 <w:lang w:eastAsia="en-US"/>
               </w:rPr>
             </w:pPr>
+            <w:proofErr w:type="gramStart"/>
             <w:r>
               <w:rPr>
                 <w:rFonts w:ascii="Bookman Old Style" w:eastAsiaTheme="minorHAnsi" w:hAnsi="Bookman Old Style"/>
@@ -1304,7 +2032,40 @@
                 <w:szCs w:val="22"/>
                 <w:lang w:eastAsia="en-US"/>
               </w:rPr>
-              <w:t>{{ foto_ktp }}</w:t>
+              <w:t xml:space="preserve">{{ </w:t>
+            </w:r>
+            <w:proofErr w:type="spellStart"/>
+            <w:r>
+              <w:rPr>
+                <w:rFonts w:ascii="Bookman Old Style" w:eastAsiaTheme="minorHAnsi" w:hAnsi="Bookman Old Style"/>
+                <w:color w:val="000000" w:themeColor="text1"/>
+                <w:sz w:val="22"/>
+                <w:szCs w:val="22"/>
+                <w:lang w:eastAsia="en-US"/>
+              </w:rPr>
+              <w:t>foto</w:t>
+            </w:r>
+            <w:proofErr w:type="gramEnd"/>
+            <w:r>
+              <w:rPr>
+                <w:rFonts w:ascii="Bookman Old Style" w:eastAsiaTheme="minorHAnsi" w:hAnsi="Bookman Old Style"/>
+                <w:color w:val="000000" w:themeColor="text1"/>
+                <w:sz w:val="22"/>
+                <w:szCs w:val="22"/>
+                <w:lang w:eastAsia="en-US"/>
+              </w:rPr>
+              <w:t>_ktp</w:t>
+            </w:r>
+            <w:proofErr w:type="spellEnd"/>
+            <w:r>
+              <w:rPr>
+                <w:rFonts w:ascii="Bookman Old Style" w:eastAsiaTheme="minorHAnsi" w:hAnsi="Bookman Old Style"/>
+                <w:color w:val="000000" w:themeColor="text1"/>
+                <w:sz w:val="22"/>
+                <w:szCs w:val="22"/>
+                <w:lang w:eastAsia="en-US"/>
+              </w:rPr>
+              <w:t xml:space="preserve"> }}</w:t>
             </w:r>
           </w:p>
         </w:tc>
@@ -1328,6 +2089,7 @@
                 <w:lang w:eastAsia="en-US"/>
               </w:rPr>
             </w:pPr>
+            <w:proofErr w:type="gramStart"/>
             <w:r>
               <w:rPr>
                 <w:rFonts w:ascii="Bookman Old Style" w:eastAsiaTheme="minorHAnsi" w:hAnsi="Bookman Old Style"/>
@@ -1336,7 +2098,40 @@
                 <w:szCs w:val="22"/>
                 <w:lang w:eastAsia="en-US"/>
               </w:rPr>
-              <w:t>{{ foto_vaksin }}</w:t>
+              <w:t xml:space="preserve">{{ </w:t>
+            </w:r>
+            <w:proofErr w:type="spellStart"/>
+            <w:r>
+              <w:rPr>
+                <w:rFonts w:ascii="Bookman Old Style" w:eastAsiaTheme="minorHAnsi" w:hAnsi="Bookman Old Style"/>
+                <w:color w:val="000000" w:themeColor="text1"/>
+                <w:sz w:val="22"/>
+                <w:szCs w:val="22"/>
+                <w:lang w:eastAsia="en-US"/>
+              </w:rPr>
+              <w:t>foto</w:t>
+            </w:r>
+            <w:proofErr w:type="gramEnd"/>
+            <w:r>
+              <w:rPr>
+                <w:rFonts w:ascii="Bookman Old Style" w:eastAsiaTheme="minorHAnsi" w:hAnsi="Bookman Old Style"/>
+                <w:color w:val="000000" w:themeColor="text1"/>
+                <w:sz w:val="22"/>
+                <w:szCs w:val="22"/>
+                <w:lang w:eastAsia="en-US"/>
+              </w:rPr>
+              <w:t>_vaksin</w:t>
+            </w:r>
+            <w:proofErr w:type="spellEnd"/>
+            <w:r>
+              <w:rPr>
+                <w:rFonts w:ascii="Bookman Old Style" w:eastAsiaTheme="minorHAnsi" w:hAnsi="Bookman Old Style"/>
+                <w:color w:val="000000" w:themeColor="text1"/>
+                <w:sz w:val="22"/>
+                <w:szCs w:val="22"/>
+                <w:lang w:eastAsia="en-US"/>
+              </w:rPr>
+              <w:t xml:space="preserve"> }}</w:t>
             </w:r>
           </w:p>
         </w:tc>
@@ -1354,8 +2149,9 @@
     </w:p>
     <w:sectPr>
       <w:headerReference w:type="default" r:id="rId8"/>
+      <w:footerReference w:type="default" r:id="rId9"/>
       <w:pgSz w:w="11906" w:h="16838"/>
-      <w:pgMar w:top="567" w:right="1021" w:bottom="794" w:left="1021" w:header="340" w:footer="720" w:gutter="0"/>
+      <w:pgMar w:top="2268" w:right="1021" w:bottom="816" w:left="1021" w:header="340" w:footer="720" w:gutter="0"/>
       <w:cols w:space="720"/>
       <w:docGrid w:linePitch="600" w:charSpace="32768"/>
     </w:sectPr>
@@ -1364,7 +2160,7 @@
 </file>
 
 <file path=word/endnotes.xml><?xml version="1.0" encoding="utf-8"?>
-<w:endnotes xmlns:wpc="http://schemas.microsoft.com/office/word/2010/wordprocessingCanvas" xmlns:cx="http://schemas.microsoft.com/office/drawing/2014/chartex" xmlns:cx1="http://schemas.microsoft.com/office/drawing/2015/9/8/chartex" xmlns:cx2="http://schemas.microsoft.com/office/drawing/2015/10/21/chartex" xmlns:cx3="http://schemas.microsoft.com/office/drawing/2016/5/9/chartex" xmlns:cx4="http://schemas.microsoft.com/office/drawing/2016/5/10/chartex" xmlns:cx5="http://schemas.microsoft.com/office/drawing/2016/5/11/chartex" xmlns:cx6="http://schemas.microsoft.com/office/drawing/2016/5/12/chartex" xmlns:cx7="http://schemas.microsoft.com/office/drawing/2016/5/13/chartex" xmlns:cx8="http://schemas.microsoft.com/office/drawing/2016/5/14/chartex" xmlns:mc="http://schemas.openxmlformats.org/markup-compatibility/2006" xmlns:aink="http://schemas.microsoft.com/office/drawing/2016/ink" xmlns:am3d="http://schemas.microsoft.com/office/drawing/2017/model3d" xmlns:o="urn:schemas-microsoft-com:office:office" xmlns:oel="http://schemas.microsoft.com/office/2019/extlst" xmlns:r="http://schemas.openxmlformats.org/officeDocument/2006/relationships" xmlns:m="http://schemas.openxmlformats.org/officeDocument/2006/math" xmlns:v="urn:schemas-microsoft-com:vml" xmlns:wp14="http://schemas.microsoft.com/office/word/2010/wordprocessingDrawing" xmlns:wp="http://schemas.openxmlformats.org/drawingml/2006/wordprocessingDrawing" xmlns:w10="urn:schemas-microsoft-com:office:word" xmlns:w="http://schemas.openxmlformats.org/wordprocessingml/2006/main" xmlns:w14="http://schemas.microsoft.com/office/word/2010/wordml" xmlns:w15="http://schemas.microsoft.com/office/word/2012/wordml" xmlns:w16cex="http://schemas.microsoft.com/office/word/2018/wordml/cex" xmlns:w16cid="http://schemas.microsoft.com/office/word/2016/wordml/cid" xmlns:w16="http://schemas.microsoft.com/office/word/2018/wordml" xmlns:w16du="http://schemas.microsoft.com/office/word/2023/wordml/word16du" xmlns:w16sdtdh="http://schemas.microsoft.com/office/word/2020/wordml/sdtdatahash" xmlns:w16se="http://schemas.microsoft.com/office/word/2015/wordml/symex" xmlns:wpg="http://schemas.microsoft.com/office/word/2010/wordprocessingGroup" xmlns:wpi="http://schemas.microsoft.com/office/word/2010/wordprocessingInk" xmlns:wne="http://schemas.microsoft.com/office/word/2006/wordml" xmlns:wps="http://schemas.microsoft.com/office/word/2010/wordprocessingShape" mc:Ignorable="w14 w15 w16se w16cid w16 w16cex w16sdtdh w16du wp14">
+<w:endnotes xmlns:wpc="http://schemas.microsoft.com/office/word/2010/wordprocessingCanvas" xmlns:cx="http://schemas.microsoft.com/office/drawing/2014/chartex" xmlns:cx1="http://schemas.microsoft.com/office/drawing/2015/9/8/chartex" xmlns:cx2="http://schemas.microsoft.com/office/drawing/2015/10/21/chartex" xmlns:cx3="http://schemas.microsoft.com/office/drawing/2016/5/9/chartex" xmlns:cx4="http://schemas.microsoft.com/office/drawing/2016/5/10/chartex" xmlns:cx5="http://schemas.microsoft.com/office/drawing/2016/5/11/chartex" xmlns:cx6="http://schemas.microsoft.com/office/drawing/2016/5/12/chartex" xmlns:cx7="http://schemas.microsoft.com/office/drawing/2016/5/13/chartex" xmlns:cx8="http://schemas.microsoft.com/office/drawing/2016/5/14/chartex" xmlns:mc="http://schemas.openxmlformats.org/markup-compatibility/2006" xmlns:aink="http://schemas.microsoft.com/office/drawing/2016/ink" xmlns:am3d="http://schemas.microsoft.com/office/drawing/2017/model3d" xmlns:o="urn:schemas-microsoft-com:office:office" xmlns:oel="http://schemas.microsoft.com/office/2019/extlst" xmlns:r="http://schemas.openxmlformats.org/officeDocument/2006/relationships" xmlns:m="http://schemas.openxmlformats.org/officeDocument/2006/math" xmlns:v="urn:schemas-microsoft-com:vml" xmlns:wp14="http://schemas.microsoft.com/office/word/2010/wordprocessingDrawing" xmlns:wp="http://schemas.openxmlformats.org/drawingml/2006/wordprocessingDrawing" xmlns:w10="urn:schemas-microsoft-com:office:word" xmlns:w="http://schemas.openxmlformats.org/wordprocessingml/2006/main" xmlns:w14="http://schemas.microsoft.com/office/word/2010/wordml" xmlns:w15="http://schemas.microsoft.com/office/word/2012/wordml" xmlns:w16cex="http://schemas.microsoft.com/office/word/2018/wordml/cex" xmlns:w16cid="http://schemas.microsoft.com/office/word/2016/wordml/cid" xmlns:w16="http://schemas.microsoft.com/office/word/2018/wordml" xmlns:w16du="http://schemas.microsoft.com/office/word/2023/wordml/word16du" xmlns:w16sdtdh="http://schemas.microsoft.com/office/word/2020/wordml/sdtdatahash" xmlns:w16sdtfl="http://schemas.microsoft.com/office/word/2024/wordml/sdtformatlock" xmlns:w16se="http://schemas.microsoft.com/office/word/2015/wordml/symex" xmlns:wpg="http://schemas.microsoft.com/office/word/2010/wordprocessingGroup" xmlns:wpi="http://schemas.microsoft.com/office/word/2010/wordprocessingInk" xmlns:wne="http://schemas.microsoft.com/office/word/2006/wordml" xmlns:wps="http://schemas.microsoft.com/office/word/2010/wordprocessingShape" mc:Ignorable="w14 w15 w16se w16cid w16 w16cex w16sdtdh w16sdtfl w16du wp14">
   <w:endnote w:type="separator" w:id="-1">
     <w:p>
       <w:r>
@@ -1382,73 +2178,29 @@
 </w:endnotes>
 </file>
 
-<file path=word/footnotes.xml><?xml version="1.0" encoding="utf-8"?>
-<w:footnotes xmlns:wpc="http://schemas.microsoft.com/office/word/2010/wordprocessingCanvas" xmlns:cx="http://schemas.microsoft.com/office/drawing/2014/chartex" xmlns:cx1="http://schemas.microsoft.com/office/drawing/2015/9/8/chartex" xmlns:cx2="http://schemas.microsoft.com/office/drawing/2015/10/21/chartex" xmlns:cx3="http://schemas.microsoft.com/office/drawing/2016/5/9/chartex" xmlns:cx4="http://schemas.microsoft.com/office/drawing/2016/5/10/chartex" xmlns:cx5="http://schemas.microsoft.com/office/drawing/2016/5/11/chartex" xmlns:cx6="http://schemas.microsoft.com/office/drawing/2016/5/12/chartex" xmlns:cx7="http://schemas.microsoft.com/office/drawing/2016/5/13/chartex" xmlns:cx8="http://schemas.microsoft.com/office/drawing/2016/5/14/chartex" xmlns:mc="http://schemas.openxmlformats.org/markup-compatibility/2006" xmlns:aink="http://schemas.microsoft.com/office/drawing/2016/ink" xmlns:am3d="http://schemas.microsoft.com/office/drawing/2017/model3d" xmlns:o="urn:schemas-microsoft-com:office:office" xmlns:oel="http://schemas.microsoft.com/office/2019/extlst" xmlns:r="http://schemas.openxmlformats.org/officeDocument/2006/relationships" xmlns:m="http://schemas.openxmlformats.org/officeDocument/2006/math" xmlns:v="urn:schemas-microsoft-com:vml" xmlns:wp14="http://schemas.microsoft.com/office/word/2010/wordprocessingDrawing" xmlns:wp="http://schemas.openxmlformats.org/drawingml/2006/wordprocessingDrawing" xmlns:w10="urn:schemas-microsoft-com:office:word" xmlns:w="http://schemas.openxmlformats.org/wordprocessingml/2006/main" xmlns:w14="http://schemas.microsoft.com/office/word/2010/wordml" xmlns:w15="http://schemas.microsoft.com/office/word/2012/wordml" xmlns:w16cex="http://schemas.microsoft.com/office/word/2018/wordml/cex" xmlns:w16cid="http://schemas.microsoft.com/office/word/2016/wordml/cid" xmlns:w16="http://schemas.microsoft.com/office/word/2018/wordml" xmlns:w16du="http://schemas.microsoft.com/office/word/2023/wordml/word16du" xmlns:w16sdtdh="http://schemas.microsoft.com/office/word/2020/wordml/sdtdatahash" xmlns:w16se="http://schemas.microsoft.com/office/word/2015/wordml/symex" xmlns:wpg="http://schemas.microsoft.com/office/word/2010/wordprocessingGroup" xmlns:wpi="http://schemas.microsoft.com/office/word/2010/wordprocessingInk" xmlns:wne="http://schemas.microsoft.com/office/word/2006/wordml" xmlns:wps="http://schemas.microsoft.com/office/word/2010/wordprocessingShape" mc:Ignorable="w14 w15 w16se w16cid w16 w16cex w16sdtdh w16du wp14">
-  <w:footnote w:type="separator" w:id="-1">
-    <w:p>
-      <w:r>
-        <w:separator/>
-      </w:r>
-    </w:p>
-  </w:footnote>
-  <w:footnote w:type="continuationSeparator" w:id="0">
-    <w:p>
-      <w:r>
-        <w:continuationSeparator/>
-      </w:r>
-    </w:p>
-  </w:footnote>
-</w:footnotes>
-</file>
-
-<file path=word/header1.xml><?xml version="1.0" encoding="utf-8"?>
-<w:hdr xmlns:wpc="http://schemas.microsoft.com/office/word/2010/wordprocessingCanvas" xmlns:cx="http://schemas.microsoft.com/office/drawing/2014/chartex" xmlns:cx1="http://schemas.microsoft.com/office/drawing/2015/9/8/chartex" xmlns:cx2="http://schemas.microsoft.com/office/drawing/2015/10/21/chartex" xmlns:cx3="http://schemas.microsoft.com/office/drawing/2016/5/9/chartex" xmlns:cx4="http://schemas.microsoft.com/office/drawing/2016/5/10/chartex" xmlns:cx5="http://schemas.microsoft.com/office/drawing/2016/5/11/chartex" xmlns:cx6="http://schemas.microsoft.com/office/drawing/2016/5/12/chartex" xmlns:cx7="http://schemas.microsoft.com/office/drawing/2016/5/13/chartex" xmlns:cx8="http://schemas.microsoft.com/office/drawing/2016/5/14/chartex" xmlns:mc="http://schemas.openxmlformats.org/markup-compatibility/2006" xmlns:aink="http://schemas.microsoft.com/office/drawing/2016/ink" xmlns:am3d="http://schemas.microsoft.com/office/drawing/2017/model3d" xmlns:o="urn:schemas-microsoft-com:office:office" xmlns:oel="http://schemas.microsoft.com/office/2019/extlst" xmlns:r="http://schemas.openxmlformats.org/officeDocument/2006/relationships" xmlns:m="http://schemas.openxmlformats.org/officeDocument/2006/math" xmlns:v="urn:schemas-microsoft-com:vml" xmlns:wp14="http://schemas.microsoft.com/office/word/2010/wordprocessingDrawing" xmlns:wp="http://schemas.openxmlformats.org/drawingml/2006/wordprocessingDrawing" xmlns:w10="urn:schemas-microsoft-com:office:word" xmlns:w="http://schemas.openxmlformats.org/wordprocessingml/2006/main" xmlns:w14="http://schemas.microsoft.com/office/word/2010/wordml" xmlns:w15="http://schemas.microsoft.com/office/word/2012/wordml" xmlns:w16cex="http://schemas.microsoft.com/office/word/2018/wordml/cex" xmlns:w16cid="http://schemas.microsoft.com/office/word/2016/wordml/cid" xmlns:w16="http://schemas.microsoft.com/office/word/2018/wordml" xmlns:w16du="http://schemas.microsoft.com/office/word/2023/wordml/word16du" xmlns:w16sdtdh="http://schemas.microsoft.com/office/word/2020/wordml/sdtdatahash" xmlns:w16se="http://schemas.microsoft.com/office/word/2015/wordml/symex" xmlns:wpg="http://schemas.microsoft.com/office/word/2010/wordprocessingGroup" xmlns:wpi="http://schemas.microsoft.com/office/word/2010/wordprocessingInk" xmlns:wne="http://schemas.microsoft.com/office/word/2006/wordml" xmlns:wps="http://schemas.microsoft.com/office/word/2010/wordprocessingShape" mc:Ignorable="w14 w15 w16se w16cid w16 w16cex w16sdtdh w16du wp14">
+<file path=word/footer1.xml><?xml version="1.0" encoding="utf-8"?>
+<w:ftr xmlns:wpc="http://schemas.microsoft.com/office/word/2010/wordprocessingCanvas" xmlns:cx="http://schemas.microsoft.com/office/drawing/2014/chartex" xmlns:cx1="http://schemas.microsoft.com/office/drawing/2015/9/8/chartex" xmlns:cx2="http://schemas.microsoft.com/office/drawing/2015/10/21/chartex" xmlns:cx3="http://schemas.microsoft.com/office/drawing/2016/5/9/chartex" xmlns:cx4="http://schemas.microsoft.com/office/drawing/2016/5/10/chartex" xmlns:cx5="http://schemas.microsoft.com/office/drawing/2016/5/11/chartex" xmlns:cx6="http://schemas.microsoft.com/office/drawing/2016/5/12/chartex" xmlns:cx7="http://schemas.microsoft.com/office/drawing/2016/5/13/chartex" xmlns:cx8="http://schemas.microsoft.com/office/drawing/2016/5/14/chartex" xmlns:mc="http://schemas.openxmlformats.org/markup-compatibility/2006" xmlns:aink="http://schemas.microsoft.com/office/drawing/2016/ink" xmlns:am3d="http://schemas.microsoft.com/office/drawing/2017/model3d" xmlns:o="urn:schemas-microsoft-com:office:office" xmlns:oel="http://schemas.microsoft.com/office/2019/extlst" xmlns:r="http://schemas.openxmlformats.org/officeDocument/2006/relationships" xmlns:m="http://schemas.openxmlformats.org/officeDocument/2006/math" xmlns:v="urn:schemas-microsoft-com:vml" xmlns:wp14="http://schemas.microsoft.com/office/word/2010/wordprocessingDrawing" xmlns:wp="http://schemas.openxmlformats.org/drawingml/2006/wordprocessingDrawing" xmlns:w10="urn:schemas-microsoft-com:office:word" xmlns:w="http://schemas.openxmlformats.org/wordprocessingml/2006/main" xmlns:w14="http://schemas.microsoft.com/office/word/2010/wordml" xmlns:w15="http://schemas.microsoft.com/office/word/2012/wordml" xmlns:w16cex="http://schemas.microsoft.com/office/word/2018/wordml/cex" xmlns:w16cid="http://schemas.microsoft.com/office/word/2016/wordml/cid" xmlns:w16="http://schemas.microsoft.com/office/word/2018/wordml" xmlns:w16du="http://schemas.microsoft.com/office/word/2023/wordml/word16du" xmlns:w16sdtdh="http://schemas.microsoft.com/office/word/2020/wordml/sdtdatahash" xmlns:w16sdtfl="http://schemas.microsoft.com/office/word/2024/wordml/sdtformatlock" xmlns:w16se="http://schemas.microsoft.com/office/word/2015/wordml/symex" xmlns:wpg="http://schemas.microsoft.com/office/word/2010/wordprocessingGroup" xmlns:wpi="http://schemas.microsoft.com/office/word/2010/wordprocessingInk" xmlns:wne="http://schemas.microsoft.com/office/word/2006/wordml" xmlns:wps="http://schemas.microsoft.com/office/word/2010/wordprocessingShape" mc:Ignorable="w14 w15 w16se w16cid w16 w16cex w16sdtdh w16sdtfl w16du wp14">
   <w:p>
     <w:pPr>
-      <w:pStyle w:val="Header"/>
+      <w:pStyle w:val="Footer"/>
     </w:pPr>
     <w:r>
       <w:rPr>
         <w:noProof/>
-        <w:lang w:val="en-ID" w:eastAsia="en-ID"/>
       </w:rPr>
       <w:drawing>
-        <wp:anchor distT="0" distB="0" distL="114300" distR="114300" simplePos="0" relativeHeight="251659264" behindDoc="0" locked="0" layoutInCell="1" allowOverlap="1" wp14:anchorId="1AB48418" wp14:editId="5DDB1F20">
+        <wp:anchor distT="0" distB="0" distL="114300" distR="114300" simplePos="0" relativeHeight="251663360" behindDoc="0" locked="0" layoutInCell="1" allowOverlap="1" wp14:anchorId="6B4FCAD7" wp14:editId="6F259D01">
           <wp:simplePos x="0" y="0"/>
-          <wp:positionH relativeFrom="column">
-            <wp:posOffset>-345871</wp:posOffset>
+          <wp:positionH relativeFrom="page">
+            <wp:posOffset>-3175</wp:posOffset>
           </wp:positionH>
           <wp:positionV relativeFrom="paragraph">
-            <wp:posOffset>-93345</wp:posOffset>
+            <wp:posOffset>-303530</wp:posOffset>
           </wp:positionV>
-          <wp:extent cx="7085965" cy="1381125"/>
+          <wp:extent cx="7647940" cy="1146810"/>
           <wp:effectExtent l="0" t="0" r="0" b="0"/>
-          <wp:wrapThrough wrapText="bothSides">
-            <wp:wrapPolygon edited="0">
-              <wp:start x="1916" y="0"/>
-              <wp:lineTo x="639" y="6852"/>
-              <wp:lineTo x="639" y="7448"/>
-              <wp:lineTo x="929" y="9534"/>
-              <wp:lineTo x="1800" y="14301"/>
-              <wp:lineTo x="697" y="15492"/>
-              <wp:lineTo x="755" y="18770"/>
-              <wp:lineTo x="406" y="19068"/>
-              <wp:lineTo x="406" y="21153"/>
-              <wp:lineTo x="21195" y="21153"/>
-              <wp:lineTo x="21312" y="19068"/>
-              <wp:lineTo x="10801" y="19068"/>
-              <wp:lineTo x="16260" y="16982"/>
-              <wp:lineTo x="16201" y="14599"/>
-              <wp:lineTo x="17305" y="14301"/>
-              <wp:lineTo x="21254" y="12811"/>
-              <wp:lineTo x="21312" y="4767"/>
-              <wp:lineTo x="16724" y="4171"/>
-              <wp:lineTo x="16724" y="1192"/>
-              <wp:lineTo x="2207" y="0"/>
-              <wp:lineTo x="1916" y="0"/>
-            </wp:wrapPolygon>
-          </wp:wrapThrough>
-          <wp:docPr id="12" name="Picture 12"/>
+          <wp:wrapNone/>
+          <wp:docPr id="1177871330" name="Picture 1"/>
           <wp:cNvGraphicFramePr>
             <a:graphicFrameLocks xmlns:a="http://schemas.openxmlformats.org/drawingml/2006/main" noChangeAspect="1"/>
           </wp:cNvGraphicFramePr>
@@ -1456,20 +2208,383 @@
             <a:graphicData uri="http://schemas.openxmlformats.org/drawingml/2006/picture">
               <pic:pic xmlns:pic="http://schemas.openxmlformats.org/drawingml/2006/picture">
                 <pic:nvPicPr>
-                  <pic:cNvPr id="12" name="Picture 12"/>
-                  <pic:cNvPicPr>
-                    <a:picLocks noChangeAspect="1"/>
-                  </pic:cNvPicPr>
+                  <pic:cNvPr id="143105163" name="Picture 143105163"/>
+                  <pic:cNvPicPr/>
                 </pic:nvPicPr>
-                <pic:blipFill>
-                  <a:blip r:embed="rId1" cstate="print">
+                <pic:blipFill rotWithShape="1">
+                  <a:blip r:embed="rId1">
                     <a:extLst>
                       <a:ext uri="{28A0092B-C50C-407E-A947-70E740481C1C}">
                         <a14:useLocalDpi xmlns:a14="http://schemas.microsoft.com/office/drawing/2010/main" val="0"/>
                       </a:ext>
                     </a:extLst>
                   </a:blip>
-                  <a:srcRect b="10754"/>
+                  <a:srcRect l="-26" t="89401" r="26"/>
+                  <a:stretch/>
+                </pic:blipFill>
+                <pic:spPr bwMode="auto">
+                  <a:xfrm>
+                    <a:off x="0" y="0"/>
+                    <a:ext cx="7647940" cy="1146810"/>
+                  </a:xfrm>
+                  <a:prstGeom prst="rect">
+                    <a:avLst/>
+                  </a:prstGeom>
+                  <a:ln>
+                    <a:noFill/>
+                  </a:ln>
+                  <a:extLst>
+                    <a:ext uri="{53640926-AAD7-44D8-BBD7-CCE9431645EC}">
+                      <a14:shadowObscured xmlns:a14="http://schemas.microsoft.com/office/drawing/2010/main"/>
+                    </a:ext>
+                  </a:extLst>
+                </pic:spPr>
+              </pic:pic>
+            </a:graphicData>
+          </a:graphic>
+          <wp14:sizeRelH relativeFrom="margin">
+            <wp14:pctWidth>0</wp14:pctWidth>
+          </wp14:sizeRelH>
+          <wp14:sizeRelV relativeFrom="margin">
+            <wp14:pctHeight>0</wp14:pctHeight>
+          </wp14:sizeRelV>
+        </wp:anchor>
+      </w:drawing>
+    </w:r>
+    <w:r>
+      <w:rPr>
+        <w:noProof/>
+      </w:rPr>
+      <mc:AlternateContent>
+        <mc:Choice Requires="wps">
+          <w:drawing>
+            <wp:anchor distT="0" distB="0" distL="114300" distR="114300" simplePos="0" relativeHeight="251664384" behindDoc="0" locked="0" layoutInCell="1" allowOverlap="1" wp14:anchorId="110515CB" wp14:editId="0B21CBEA">
+              <wp:simplePos x="0" y="0"/>
+              <wp:positionH relativeFrom="page">
+                <wp:posOffset>-3175</wp:posOffset>
+              </wp:positionH>
+              <wp:positionV relativeFrom="paragraph">
+                <wp:posOffset>-866612</wp:posOffset>
+              </wp:positionV>
+              <wp:extent cx="8458200" cy="3339465"/>
+              <wp:effectExtent l="0" t="0" r="0" b="0"/>
+              <wp:wrapNone/>
+              <wp:docPr id="1589575691" name="Freeform 20"/>
+              <wp:cNvGraphicFramePr/>
+              <a:graphic xmlns:a="http://schemas.openxmlformats.org/drawingml/2006/main">
+                <a:graphicData uri="http://schemas.microsoft.com/office/word/2010/wordprocessingShape">
+                  <wps:wsp>
+                    <wps:cNvSpPr/>
+                    <wps:spPr>
+                      <a:xfrm flipH="1" flipV="1">
+                        <a:off x="0" y="0"/>
+                        <a:ext cx="8458200" cy="3339465"/>
+                      </a:xfrm>
+                      <a:custGeom>
+                        <a:avLst/>
+                        <a:gdLst/>
+                        <a:ahLst/>
+                        <a:cxnLst/>
+                        <a:rect l="l" t="t" r="r" b="b"/>
+                        <a:pathLst>
+                          <a:path w="8775315" h="3270799">
+                            <a:moveTo>
+                              <a:pt x="8775315" y="3270800"/>
+                            </a:moveTo>
+                            <a:lnTo>
+                              <a:pt x="0" y="3270800"/>
+                            </a:lnTo>
+                            <a:lnTo>
+                              <a:pt x="0" y="0"/>
+                            </a:lnTo>
+                            <a:lnTo>
+                              <a:pt x="8775315" y="0"/>
+                            </a:lnTo>
+                            <a:lnTo>
+                              <a:pt x="8775315" y="3270800"/>
+                            </a:lnTo>
+                            <a:close/>
+                          </a:path>
+                        </a:pathLst>
+                      </a:custGeom>
+                      <a:blipFill>
+                        <a:blip r:embed="rId2">
+                          <a:alphaModFix amt="16000"/>
+                          <a:extLst>
+                            <a:ext uri="{96DAC541-7B7A-43D3-8B79-37D633B846F1}">
+                              <asvg:svgBlip xmlns:asvg="http://schemas.microsoft.com/office/drawing/2016/SVG/main" r:embed="rId3"/>
+                            </a:ext>
+                          </a:extLst>
+                        </a:blip>
+                        <a:stretch>
+                          <a:fillRect/>
+                        </a:stretch>
+                      </a:blipFill>
+                    </wps:spPr>
+                    <wps:bodyPr/>
+                  </wps:wsp>
+                </a:graphicData>
+              </a:graphic>
+              <wp14:sizeRelH relativeFrom="margin">
+                <wp14:pctWidth>0</wp14:pctWidth>
+              </wp14:sizeRelH>
+              <wp14:sizeRelV relativeFrom="margin">
+                <wp14:pctHeight>0</wp14:pctHeight>
+              </wp14:sizeRelV>
+            </wp:anchor>
+          </w:drawing>
+        </mc:Choice>
+        <mc:Fallback>
+          <w:pict>
+            <v:shape w14:anchorId="2852BA44" id="Freeform 20" o:spid="_x0000_s1026" style="position:absolute;margin-left:-.25pt;margin-top:-68.25pt;width:666pt;height:262.95pt;flip:x y;z-index:251664384;visibility:visible;mso-wrap-style:square;mso-width-percent:0;mso-height-percent:0;mso-wrap-distance-left:9pt;mso-wrap-distance-top:0;mso-wrap-distance-right:9pt;mso-wrap-distance-bottom:0;mso-position-horizontal:absolute;mso-position-horizontal-relative:page;mso-position-vertical:absolute;mso-position-vertical-relative:text;mso-width-percent:0;mso-height-percent:0;mso-width-relative:margin;mso-height-relative:margin;v-text-anchor:top" coordsize="8775315,3270799" o:gfxdata="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" path="m8775315,3270800l,3270800,,,8775315,r,3270800xe" stroked="f">
+              <v:fill r:id="rId4" o:title="" opacity="10486f" recolor="t" rotate="t" type="frame"/>
+              <v:path arrowok="t"/>
+              <w10:wrap anchorx="page"/>
+            </v:shape>
+          </w:pict>
+        </mc:Fallback>
+      </mc:AlternateContent>
+    </w:r>
+  </w:p>
+  <w:p>
+    <w:pPr>
+      <w:pStyle w:val="Footer"/>
+    </w:pPr>
+  </w:p>
+</w:ftr>
+</file>
+
+<file path=word/footnotes.xml><?xml version="1.0" encoding="utf-8"?>
+<w:footnotes xmlns:wpc="http://schemas.microsoft.com/office/word/2010/wordprocessingCanvas" xmlns:cx="http://schemas.microsoft.com/office/drawing/2014/chartex" xmlns:cx1="http://schemas.microsoft.com/office/drawing/2015/9/8/chartex" xmlns:cx2="http://schemas.microsoft.com/office/drawing/2015/10/21/chartex" xmlns:cx3="http://schemas.microsoft.com/office/drawing/2016/5/9/chartex" xmlns:cx4="http://schemas.microsoft.com/office/drawing/2016/5/10/chartex" xmlns:cx5="http://schemas.microsoft.com/office/drawing/2016/5/11/chartex" xmlns:cx6="http://schemas.microsoft.com/office/drawing/2016/5/12/chartex" xmlns:cx7="http://schemas.microsoft.com/office/drawing/2016/5/13/chartex" xmlns:cx8="http://schemas.microsoft.com/office/drawing/2016/5/14/chartex" xmlns:mc="http://schemas.openxmlformats.org/markup-compatibility/2006" xmlns:aink="http://schemas.microsoft.com/office/drawing/2016/ink" xmlns:am3d="http://schemas.microsoft.com/office/drawing/2017/model3d" xmlns:o="urn:schemas-microsoft-com:office:office" xmlns:oel="http://schemas.microsoft.com/office/2019/extlst" xmlns:r="http://schemas.openxmlformats.org/officeDocument/2006/relationships" xmlns:m="http://schemas.openxmlformats.org/officeDocument/2006/math" xmlns:v="urn:schemas-microsoft-com:vml" xmlns:wp14="http://schemas.microsoft.com/office/word/2010/wordprocessingDrawing" xmlns:wp="http://schemas.openxmlformats.org/drawingml/2006/wordprocessingDrawing" xmlns:w10="urn:schemas-microsoft-com:office:word" xmlns:w="http://schemas.openxmlformats.org/wordprocessingml/2006/main" xmlns:w14="http://schemas.microsoft.com/office/word/2010/wordml" xmlns:w15="http://schemas.microsoft.com/office/word/2012/wordml" xmlns:w16cex="http://schemas.microsoft.com/office/word/2018/wordml/cex" xmlns:w16cid="http://schemas.microsoft.com/office/word/2016/wordml/cid" xmlns:w16="http://schemas.microsoft.com/office/word/2018/wordml" xmlns:w16du="http://schemas.microsoft.com/office/word/2023/wordml/word16du" xmlns:w16sdtdh="http://schemas.microsoft.com/office/word/2020/wordml/sdtdatahash" xmlns:w16sdtfl="http://schemas.microsoft.com/office/word/2024/wordml/sdtformatlock" xmlns:w16se="http://schemas.microsoft.com/office/word/2015/wordml/symex" xmlns:wpg="http://schemas.microsoft.com/office/word/2010/wordprocessingGroup" xmlns:wpi="http://schemas.microsoft.com/office/word/2010/wordprocessingInk" xmlns:wne="http://schemas.microsoft.com/office/word/2006/wordml" xmlns:wps="http://schemas.microsoft.com/office/word/2010/wordprocessingShape" mc:Ignorable="w14 w15 w16se w16cid w16 w16cex w16sdtdh w16sdtfl w16du wp14">
+  <w:footnote w:type="separator" w:id="-1">
+    <w:p>
+      <w:r>
+        <w:separator/>
+      </w:r>
+    </w:p>
+  </w:footnote>
+  <w:footnote w:type="continuationSeparator" w:id="0">
+    <w:p>
+      <w:r>
+        <w:continuationSeparator/>
+      </w:r>
+    </w:p>
+  </w:footnote>
+</w:footnotes>
+</file>
+
+<file path=word/header1.xml><?xml version="1.0" encoding="utf-8"?>
+<w:hdr xmlns:wpc="http://schemas.microsoft.com/office/word/2010/wordprocessingCanvas" xmlns:cx="http://schemas.microsoft.com/office/drawing/2014/chartex" xmlns:cx1="http://schemas.microsoft.com/office/drawing/2015/9/8/chartex" xmlns:cx2="http://schemas.microsoft.com/office/drawing/2015/10/21/chartex" xmlns:cx3="http://schemas.microsoft.com/office/drawing/2016/5/9/chartex" xmlns:cx4="http://schemas.microsoft.com/office/drawing/2016/5/10/chartex" xmlns:cx5="http://schemas.microsoft.com/office/drawing/2016/5/11/chartex" xmlns:cx6="http://schemas.microsoft.com/office/drawing/2016/5/12/chartex" xmlns:cx7="http://schemas.microsoft.com/office/drawing/2016/5/13/chartex" xmlns:cx8="http://schemas.microsoft.com/office/drawing/2016/5/14/chartex" xmlns:mc="http://schemas.openxmlformats.org/markup-compatibility/2006" xmlns:aink="http://schemas.microsoft.com/office/drawing/2016/ink" xmlns:am3d="http://schemas.microsoft.com/office/drawing/2017/model3d" xmlns:o="urn:schemas-microsoft-com:office:office" xmlns:oel="http://schemas.microsoft.com/office/2019/extlst" xmlns:r="http://schemas.openxmlformats.org/officeDocument/2006/relationships" xmlns:m="http://schemas.openxmlformats.org/officeDocument/2006/math" xmlns:v="urn:schemas-microsoft-com:vml" xmlns:wp14="http://schemas.microsoft.com/office/word/2010/wordprocessingDrawing" xmlns:wp="http://schemas.openxmlformats.org/drawingml/2006/wordprocessingDrawing" xmlns:w10="urn:schemas-microsoft-com:office:word" xmlns:w="http://schemas.openxmlformats.org/wordprocessingml/2006/main" xmlns:w14="http://schemas.microsoft.com/office/word/2010/wordml" xmlns:w15="http://schemas.microsoft.com/office/word/2012/wordml" xmlns:w16cex="http://schemas.microsoft.com/office/word/2018/wordml/cex" xmlns:w16cid="http://schemas.microsoft.com/office/word/2016/wordml/cid" xmlns:w16="http://schemas.microsoft.com/office/word/2018/wordml" xmlns:w16du="http://schemas.microsoft.com/office/word/2023/wordml/word16du" xmlns:w16sdtdh="http://schemas.microsoft.com/office/word/2020/wordml/sdtdatahash" xmlns:w16sdtfl="http://schemas.microsoft.com/office/word/2024/wordml/sdtformatlock" xmlns:w16se="http://schemas.microsoft.com/office/word/2015/wordml/symex" xmlns:wpg="http://schemas.microsoft.com/office/word/2010/wordprocessingGroup" xmlns:wpi="http://schemas.microsoft.com/office/word/2010/wordprocessingInk" xmlns:wne="http://schemas.microsoft.com/office/word/2006/wordml" xmlns:wps="http://schemas.microsoft.com/office/word/2010/wordprocessingShape" mc:Ignorable="w14 w15 w16se w16cid w16 w16cex w16sdtdh w16sdtfl w16du wp14">
+  <w:p>
+    <w:pPr>
+      <w:pStyle w:val="Header"/>
+      <w:tabs>
+        <w:tab w:val="clear" w:pos="4680"/>
+        <w:tab w:val="clear" w:pos="9360"/>
+        <w:tab w:val="left" w:pos="7721"/>
+      </w:tabs>
+    </w:pPr>
+    <w:r>
+      <w:rPr>
+        <w:noProof/>
+      </w:rPr>
+      <mc:AlternateContent>
+        <mc:Choice Requires="wps">
+          <w:drawing>
+            <wp:anchor distT="0" distB="0" distL="114300" distR="114300" simplePos="0" relativeHeight="251661312" behindDoc="0" locked="0" layoutInCell="1" allowOverlap="1" wp14:anchorId="2F5A59CC" wp14:editId="3833A839">
+              <wp:simplePos x="0" y="0"/>
+              <wp:positionH relativeFrom="column">
+                <wp:posOffset>-1297468</wp:posOffset>
+              </wp:positionH>
+              <wp:positionV relativeFrom="paragraph">
+                <wp:posOffset>-1875287</wp:posOffset>
+              </wp:positionV>
+              <wp:extent cx="8775315" cy="3270799"/>
+              <wp:effectExtent l="0" t="0" r="6985" b="0"/>
+              <wp:wrapNone/>
+              <wp:docPr id="20" name="Freeform 20"/>
+              <wp:cNvGraphicFramePr/>
+              <a:graphic xmlns:a="http://schemas.openxmlformats.org/drawingml/2006/main">
+                <a:graphicData uri="http://schemas.microsoft.com/office/word/2010/wordprocessingShape">
+                  <wps:wsp>
+                    <wps:cNvSpPr/>
+                    <wps:spPr>
+                      <a:xfrm flipH="1" flipV="1">
+                        <a:off x="0" y="0"/>
+                        <a:ext cx="8775315" cy="3270799"/>
+                      </a:xfrm>
+                      <a:custGeom>
+                        <a:avLst/>
+                        <a:gdLst/>
+                        <a:ahLst/>
+                        <a:cxnLst/>
+                        <a:rect l="l" t="t" r="r" b="b"/>
+                        <a:pathLst>
+                          <a:path w="8775315" h="3270799">
+                            <a:moveTo>
+                              <a:pt x="8775315" y="3270800"/>
+                            </a:moveTo>
+                            <a:lnTo>
+                              <a:pt x="0" y="3270800"/>
+                            </a:lnTo>
+                            <a:lnTo>
+                              <a:pt x="0" y="0"/>
+                            </a:lnTo>
+                            <a:lnTo>
+                              <a:pt x="8775315" y="0"/>
+                            </a:lnTo>
+                            <a:lnTo>
+                              <a:pt x="8775315" y="3270800"/>
+                            </a:lnTo>
+                            <a:close/>
+                          </a:path>
+                        </a:pathLst>
+                      </a:custGeom>
+                      <a:blipFill>
+                        <a:blip r:embed="rId1">
+                          <a:alphaModFix amt="16000"/>
+                          <a:extLst>
+                            <a:ext uri="{96DAC541-7B7A-43D3-8B79-37D633B846F1}">
+                              <asvg:svgBlip xmlns:asvg="http://schemas.microsoft.com/office/drawing/2016/SVG/main" r:embed="rId2"/>
+                            </a:ext>
+                          </a:extLst>
+                        </a:blip>
+                        <a:stretch>
+                          <a:fillRect/>
+                        </a:stretch>
+                      </a:blipFill>
+                    </wps:spPr>
+                    <wps:txbx>
+                      <w:txbxContent>
+                        <w:p/>
+                      </w:txbxContent>
+                    </wps:txbx>
+                    <wps:bodyPr/>
+                  </wps:wsp>
+                </a:graphicData>
+              </a:graphic>
+            </wp:anchor>
+          </w:drawing>
+        </mc:Choice>
+        <mc:Fallback>
+          <w:pict>
+            <v:shape w14:anchorId="2F5A59CC" id="Freeform 20" o:spid="_x0000_s1026" style="position:absolute;margin-left:-102.15pt;margin-top:-147.65pt;width:690.95pt;height:257.55pt;flip:x y;z-index:251661312;visibility:visible;mso-wrap-style:square;mso-wrap-distance-left:9pt;mso-wrap-distance-top:0;mso-wrap-distance-right:9pt;mso-wrap-distance-bottom:0;mso-position-horizontal:absolute;mso-position-horizontal-relative:text;mso-position-vertical:absolute;mso-position-vertical-relative:text;v-text-anchor:top" coordsize="8775315,3270799" o:spt="100" o:gfxdata="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" adj="-11796480,,5400" path="m8775315,3270800l,3270800,,,8775315,r,3270800xe" stroked="f">
+              <v:fill r:id="rId3" o:title="" opacity="10486f" recolor="t" rotate="t" type="frame"/>
+              <v:stroke joinstyle="miter"/>
+              <v:formulas/>
+              <v:path arrowok="t" o:connecttype="custom" textboxrect="0,0,8775315,3270799"/>
+              <v:textbox>
+                <w:txbxContent>
+                  <w:p/>
+                </w:txbxContent>
+              </v:textbox>
+            </v:shape>
+          </w:pict>
+        </mc:Fallback>
+      </mc:AlternateContent>
+    </w:r>
+    <w:r>
+      <w:rPr>
+        <w:noProof/>
+      </w:rPr>
+      <w:drawing>
+        <wp:anchor distT="0" distB="0" distL="114300" distR="114300" simplePos="0" relativeHeight="251659264" behindDoc="0" locked="0" layoutInCell="1" allowOverlap="1" wp14:anchorId="30C966A1" wp14:editId="3972F2C0">
+          <wp:simplePos x="0" y="0"/>
+          <wp:positionH relativeFrom="column">
+            <wp:posOffset>-807720</wp:posOffset>
+          </wp:positionH>
+          <wp:positionV relativeFrom="paragraph">
+            <wp:posOffset>-144943</wp:posOffset>
+          </wp:positionV>
+          <wp:extent cx="5227320" cy="1139190"/>
+          <wp:effectExtent l="0" t="0" r="0" b="3810"/>
+          <wp:wrapNone/>
+          <wp:docPr id="143105163" name="Picture 1"/>
+          <wp:cNvGraphicFramePr>
+            <a:graphicFrameLocks xmlns:a="http://schemas.openxmlformats.org/drawingml/2006/main" noChangeAspect="1"/>
+          </wp:cNvGraphicFramePr>
+          <a:graphic xmlns:a="http://schemas.openxmlformats.org/drawingml/2006/main">
+            <a:graphicData uri="http://schemas.openxmlformats.org/drawingml/2006/picture">
+              <pic:pic xmlns:pic="http://schemas.openxmlformats.org/drawingml/2006/picture">
+                <pic:nvPicPr>
+                  <pic:cNvPr id="143105163" name="Picture 143105163"/>
+                  <pic:cNvPicPr/>
+                </pic:nvPicPr>
+                <pic:blipFill rotWithShape="1">
+                  <a:blip r:embed="rId4">
+                    <a:extLst>
+                      <a:ext uri="{28A0092B-C50C-407E-A947-70E740481C1C}">
+                        <a14:useLocalDpi xmlns:a14="http://schemas.microsoft.com/office/drawing/2010/main" val="0"/>
+                      </a:ext>
+                    </a:extLst>
+                  </a:blip>
+                  <a:srcRect r="31175" b="89401"/>
+                  <a:stretch/>
+                </pic:blipFill>
+                <pic:spPr bwMode="auto">
+                  <a:xfrm>
+                    <a:off x="0" y="0"/>
+                    <a:ext cx="5227320" cy="1139190"/>
+                  </a:xfrm>
+                  <a:prstGeom prst="rect">
+                    <a:avLst/>
+                  </a:prstGeom>
+                  <a:ln>
+                    <a:noFill/>
+                  </a:ln>
+                  <a:extLst>
+                    <a:ext uri="{53640926-AAD7-44D8-BBD7-CCE9431645EC}">
+                      <a14:shadowObscured xmlns:a14="http://schemas.microsoft.com/office/drawing/2010/main"/>
+                    </a:ext>
+                  </a:extLst>
+                </pic:spPr>
+              </pic:pic>
+            </a:graphicData>
+          </a:graphic>
+          <wp14:sizeRelH relativeFrom="margin">
+            <wp14:pctWidth>0</wp14:pctWidth>
+          </wp14:sizeRelH>
+          <wp14:sizeRelV relativeFrom="margin">
+            <wp14:pctHeight>0</wp14:pctHeight>
+          </wp14:sizeRelV>
+        </wp:anchor>
+      </w:drawing>
+    </w:r>
+    <w:r>
+      <w:rPr>
+        <w:noProof/>
+      </w:rPr>
+      <w:drawing>
+        <wp:anchor distT="0" distB="0" distL="114300" distR="114300" simplePos="0" relativeHeight="251660288" behindDoc="0" locked="0" layoutInCell="1" allowOverlap="1" wp14:anchorId="09D77570" wp14:editId="29C0FA51">
+          <wp:simplePos x="0" y="0"/>
+          <wp:positionH relativeFrom="column">
+            <wp:posOffset>4082616</wp:posOffset>
+          </wp:positionH>
+          <wp:positionV relativeFrom="paragraph">
+            <wp:posOffset>95527</wp:posOffset>
+          </wp:positionV>
+          <wp:extent cx="2536825" cy="964565"/>
+          <wp:effectExtent l="0" t="0" r="0" b="0"/>
+          <wp:wrapNone/>
+          <wp:docPr id="87887180" name="Picture 3"/>
+          <wp:cNvGraphicFramePr>
+            <a:graphicFrameLocks xmlns:a="http://schemas.openxmlformats.org/drawingml/2006/main" noChangeAspect="1"/>
+          </wp:cNvGraphicFramePr>
+          <a:graphic xmlns:a="http://schemas.openxmlformats.org/drawingml/2006/main">
+            <a:graphicData uri="http://schemas.openxmlformats.org/drawingml/2006/picture">
+              <pic:pic xmlns:pic="http://schemas.openxmlformats.org/drawingml/2006/picture">
+                <pic:nvPicPr>
+                  <pic:cNvPr id="87887180" name="Picture 87887180"/>
+                  <pic:cNvPicPr/>
+                </pic:nvPicPr>
+                <pic:blipFill>
+                  <a:blip r:embed="rId5">
+                    <a:extLst>
+                      <a:ext uri="{28A0092B-C50C-407E-A947-70E740481C1C}">
+                        <a14:useLocalDpi xmlns:a14="http://schemas.microsoft.com/office/drawing/2010/main" val="0"/>
+                      </a:ext>
+                    </a:extLst>
+                  </a:blip>
                   <a:stretch>
                     <a:fillRect/>
                   </a:stretch>
@@ -1477,22 +2592,32 @@
                 <pic:spPr>
                   <a:xfrm>
                     <a:off x="0" y="0"/>
-                    <a:ext cx="7085965" cy="1381125"/>
+                    <a:ext cx="2536825" cy="964565"/>
                   </a:xfrm>
                   <a:prstGeom prst="rect">
                     <a:avLst/>
                   </a:prstGeom>
-                  <a:noFill/>
-                  <a:ln>
-                    <a:noFill/>
-                  </a:ln>
                 </pic:spPr>
               </pic:pic>
             </a:graphicData>
           </a:graphic>
+          <wp14:sizeRelH relativeFrom="margin">
+            <wp14:pctWidth>0</wp14:pctWidth>
+          </wp14:sizeRelH>
+          <wp14:sizeRelV relativeFrom="margin">
+            <wp14:pctHeight>0</wp14:pctHeight>
+          </wp14:sizeRelV>
         </wp:anchor>
       </w:drawing>
     </w:r>
+    <w:r>
+      <w:tab/>
+    </w:r>
+  </w:p>
+  <w:p>
+    <w:pPr>
+      <w:pStyle w:val="Header"/>
+    </w:pPr>
   </w:p>
   <w:p>
     <w:pPr>
@@ -1503,7 +2628,7 @@
 </file>
 
 <file path=word/numbering.xml><?xml version="1.0" encoding="utf-8"?>
-<w:numbering xmlns:wpc="http://schemas.microsoft.com/office/word/2010/wordprocessingCanvas" xmlns:cx="http://schemas.microsoft.com/office/drawing/2014/chartex" xmlns:cx1="http://schemas.microsoft.com/office/drawing/2015/9/8/chartex" xmlns:cx2="http://schemas.microsoft.com/office/drawing/2015/10/21/chartex" xmlns:cx3="http://schemas.microsoft.com/office/drawing/2016/5/9/chartex" xmlns:cx4="http://schemas.microsoft.com/office/drawing/2016/5/10/chartex" xmlns:cx5="http://schemas.microsoft.com/office/drawing/2016/5/11/chartex" xmlns:cx6="http://schemas.microsoft.com/office/drawing/2016/5/12/chartex" xmlns:cx7="http://schemas.microsoft.com/office/drawing/2016/5/13/chartex" xmlns:cx8="http://schemas.microsoft.com/office/drawing/2016/5/14/chartex" xmlns:mc="http://schemas.openxmlformats.org/markup-compatibility/2006" xmlns:aink="http://schemas.microsoft.com/office/drawing/2016/ink" xmlns:am3d="http://schemas.microsoft.com/office/drawing/2017/model3d" xmlns:o="urn:schemas-microsoft-com:office:office" xmlns:oel="http://schemas.microsoft.com/office/2019/extlst" xmlns:r="http://schemas.openxmlformats.org/officeDocument/2006/relationships" xmlns:m="http://schemas.openxmlformats.org/officeDocument/2006/math" xmlns:v="urn:schemas-microsoft-com:vml" xmlns:wp14="http://schemas.microsoft.com/office/word/2010/wordprocessingDrawing" xmlns:wp="http://schemas.openxmlformats.org/drawingml/2006/wordprocessingDrawing" xmlns:w10="urn:schemas-microsoft-com:office:word" xmlns:w="http://schemas.openxmlformats.org/wordprocessingml/2006/main" xmlns:w14="http://schemas.microsoft.com/office/word/2010/wordml" xmlns:w15="http://schemas.microsoft.com/office/word/2012/wordml" xmlns:w16cex="http://schemas.microsoft.com/office/word/2018/wordml/cex" xmlns:w16cid="http://schemas.microsoft.com/office/word/2016/wordml/cid" xmlns:w16="http://schemas.microsoft.com/office/word/2018/wordml" xmlns:w16du="http://schemas.microsoft.com/office/word/2023/wordml/word16du" xmlns:w16sdtdh="http://schemas.microsoft.com/office/word/2020/wordml/sdtdatahash" xmlns:w16se="http://schemas.microsoft.com/office/word/2015/wordml/symex" xmlns:wpg="http://schemas.microsoft.com/office/word/2010/wordprocessingGroup" xmlns:wpi="http://schemas.microsoft.com/office/word/2010/wordprocessingInk" xmlns:wne="http://schemas.microsoft.com/office/word/2006/wordml" xmlns:wps="http://schemas.microsoft.com/office/word/2010/wordprocessingShape" mc:Ignorable="w14 w15 w16se w16cid w16 w16cex w16sdtdh w16du wp14">
+<w:numbering xmlns:wpc="http://schemas.microsoft.com/office/word/2010/wordprocessingCanvas" xmlns:cx="http://schemas.microsoft.com/office/drawing/2014/chartex" xmlns:cx1="http://schemas.microsoft.com/office/drawing/2015/9/8/chartex" xmlns:cx2="http://schemas.microsoft.com/office/drawing/2015/10/21/chartex" xmlns:cx3="http://schemas.microsoft.com/office/drawing/2016/5/9/chartex" xmlns:cx4="http://schemas.microsoft.com/office/drawing/2016/5/10/chartex" xmlns:cx5="http://schemas.microsoft.com/office/drawing/2016/5/11/chartex" xmlns:cx6="http://schemas.microsoft.com/office/drawing/2016/5/12/chartex" xmlns:cx7="http://schemas.microsoft.com/office/drawing/2016/5/13/chartex" xmlns:cx8="http://schemas.microsoft.com/office/drawing/2016/5/14/chartex" xmlns:mc="http://schemas.openxmlformats.org/markup-compatibility/2006" xmlns:aink="http://schemas.microsoft.com/office/drawing/2016/ink" xmlns:am3d="http://schemas.microsoft.com/office/drawing/2017/model3d" xmlns:o="urn:schemas-microsoft-com:office:office" xmlns:oel="http://schemas.microsoft.com/office/2019/extlst" xmlns:r="http://schemas.openxmlformats.org/officeDocument/2006/relationships" xmlns:m="http://schemas.openxmlformats.org/officeDocument/2006/math" xmlns:v="urn:schemas-microsoft-com:vml" xmlns:wp14="http://schemas.microsoft.com/office/word/2010/wordprocessingDrawing" xmlns:wp="http://schemas.openxmlformats.org/drawingml/2006/wordprocessingDrawing" xmlns:w10="urn:schemas-microsoft-com:office:word" xmlns:w="http://schemas.openxmlformats.org/wordprocessingml/2006/main" xmlns:w14="http://schemas.microsoft.com/office/word/2010/wordml" xmlns:w15="http://schemas.microsoft.com/office/word/2012/wordml" xmlns:w16cex="http://schemas.microsoft.com/office/word/2018/wordml/cex" xmlns:w16cid="http://schemas.microsoft.com/office/word/2016/wordml/cid" xmlns:w16="http://schemas.microsoft.com/office/word/2018/wordml" xmlns:w16du="http://schemas.microsoft.com/office/word/2023/wordml/word16du" xmlns:w16sdtdh="http://schemas.microsoft.com/office/word/2020/wordml/sdtdatahash" xmlns:w16sdtfl="http://schemas.microsoft.com/office/word/2024/wordml/sdtformatlock" xmlns:w16se="http://schemas.microsoft.com/office/word/2015/wordml/symex" xmlns:wpg="http://schemas.microsoft.com/office/word/2010/wordprocessingGroup" xmlns:wpi="http://schemas.microsoft.com/office/word/2010/wordprocessingInk" xmlns:wne="http://schemas.microsoft.com/office/word/2006/wordml" xmlns:wps="http://schemas.microsoft.com/office/word/2010/wordprocessingShape" mc:Ignorable="w14 w15 w16se w16cid w16 w16cex w16sdtdh w16sdtfl w16du wp14">
   <w:abstractNum w:abstractNumId="0" w15:restartNumberingAfterBreak="0">
     <w:nsid w:val="2B396B3E"/>
     <w:multiLevelType w:val="hybridMultilevel"/>
@@ -1692,7 +2817,7 @@
 </file>
 
 <file path=word/styles.xml><?xml version="1.0" encoding="utf-8"?>
-<w:styles xmlns:mc="http://schemas.openxmlformats.org/markup-compatibility/2006" xmlns:r="http://schemas.openxmlformats.org/officeDocument/2006/relationships" xmlns:w="http://schemas.openxmlformats.org/wordprocessingml/2006/main" xmlns:w14="http://schemas.microsoft.com/office/word/2010/wordml" xmlns:w15="http://schemas.microsoft.com/office/word/2012/wordml" xmlns:w16cex="http://schemas.microsoft.com/office/word/2018/wordml/cex" xmlns:w16cid="http://schemas.microsoft.com/office/word/2016/wordml/cid" xmlns:w16="http://schemas.microsoft.com/office/word/2018/wordml" xmlns:w16du="http://schemas.microsoft.com/office/word/2023/wordml/word16du" xmlns:w16sdtdh="http://schemas.microsoft.com/office/word/2020/wordml/sdtdatahash" xmlns:w16se="http://schemas.microsoft.com/office/word/2015/wordml/symex" mc:Ignorable="w14 w15 w16se w16cid w16 w16cex w16sdtdh w16du">
+<w:styles xmlns:mc="http://schemas.openxmlformats.org/markup-compatibility/2006" xmlns:r="http://schemas.openxmlformats.org/officeDocument/2006/relationships" xmlns:w="http://schemas.openxmlformats.org/wordprocessingml/2006/main" xmlns:w14="http://schemas.microsoft.com/office/word/2010/wordml" xmlns:w15="http://schemas.microsoft.com/office/word/2012/wordml" xmlns:w16cex="http://schemas.microsoft.com/office/word/2018/wordml/cex" xmlns:w16cid="http://schemas.microsoft.com/office/word/2016/wordml/cid" xmlns:w16="http://schemas.microsoft.com/office/word/2018/wordml" xmlns:w16du="http://schemas.microsoft.com/office/word/2023/wordml/word16du" xmlns:w16sdtdh="http://schemas.microsoft.com/office/word/2020/wordml/sdtdatahash" xmlns:w16sdtfl="http://schemas.microsoft.com/office/word/2024/wordml/sdtformatlock" xmlns:w16se="http://schemas.microsoft.com/office/word/2015/wordml/symex" mc:Ignorable="w14 w15 w16se w16cid w16 w16cex w16sdtdh w16sdtfl w16du">
   <w:docDefaults>
     <w:rPrDefault>
       <w:rPr>

</xml_diff>

<commit_message>
Feat: Fix surat tugas template, fix signing surat tugas
</commit_message>
<xml_diff>
--- a/oims/templates/docs/st.docx
+++ b/oims/templates/docs/st.docx
@@ -55,49 +55,21 @@
           <w:szCs w:val="22"/>
         </w:rPr>
       </w:pPr>
-      <w:proofErr w:type="gramStart"/>
-      <w:r>
-        <w:rPr>
-          <w:rFonts w:ascii="Bookman Old Style" w:hAnsi="Bookman Old Style"/>
-          <w:sz w:val="22"/>
-          <w:szCs w:val="22"/>
-        </w:rPr>
-        <w:t>No :</w:t>
-      </w:r>
-      <w:proofErr w:type="gramEnd"/>
-      <w:r>
-        <w:rPr>
-          <w:rFonts w:ascii="Bookman Old Style" w:hAnsi="Bookman Old Style"/>
-          <w:sz w:val="22"/>
-          <w:szCs w:val="22"/>
-        </w:rPr>
-        <w:t xml:space="preserve"> </w:t>
-      </w:r>
-      <w:r>
-        <w:rPr>
-          <w:rFonts w:ascii="Bookman Old Style" w:hAnsi="Bookman Old Style"/>
-          <w:sz w:val="22"/>
-          <w:szCs w:val="22"/>
-        </w:rPr>
-        <w:t xml:space="preserve">{{ </w:t>
-      </w:r>
-      <w:proofErr w:type="spellStart"/>
-      <w:r>
-        <w:rPr>
-          <w:rFonts w:ascii="Bookman Old Style" w:hAnsi="Bookman Old Style"/>
-          <w:sz w:val="22"/>
-          <w:szCs w:val="22"/>
-        </w:rPr>
-        <w:t>no_surat</w:t>
-      </w:r>
-      <w:proofErr w:type="spellEnd"/>
-      <w:r>
-        <w:rPr>
-          <w:rFonts w:ascii="Bookman Old Style" w:hAnsi="Bookman Old Style"/>
-          <w:sz w:val="22"/>
-          <w:szCs w:val="22"/>
-        </w:rPr>
-        <w:t xml:space="preserve"> }}</w:t>
+      <w:r>
+        <w:rPr>
+          <w:rFonts w:ascii="Bookman Old Style" w:hAnsi="Bookman Old Style"/>
+          <w:sz w:val="22"/>
+          <w:szCs w:val="22"/>
+        </w:rPr>
+        <w:t xml:space="preserve">No : </w:t>
+      </w:r>
+      <w:r>
+        <w:rPr>
+          <w:rFonts w:ascii="Bookman Old Style" w:hAnsi="Bookman Old Style"/>
+          <w:sz w:val="22"/>
+          <w:szCs w:val="22"/>
+        </w:rPr>
+        <w:t>{{ no_surat }}</w:t>
       </w:r>
     </w:p>
     <w:p>
@@ -137,79 +109,7 @@
           <w:sz w:val="22"/>
           <w:szCs w:val="22"/>
         </w:rPr>
-        <w:t xml:space="preserve">Yang </w:t>
-      </w:r>
-      <w:proofErr w:type="spellStart"/>
-      <w:r>
-        <w:rPr>
-          <w:rFonts w:ascii="Bookman Old Style" w:hAnsi="Bookman Old Style"/>
-          <w:sz w:val="22"/>
-          <w:szCs w:val="22"/>
-        </w:rPr>
-        <w:t>bertanda</w:t>
-      </w:r>
-      <w:proofErr w:type="spellEnd"/>
-      <w:r>
-        <w:rPr>
-          <w:rFonts w:ascii="Bookman Old Style" w:hAnsi="Bookman Old Style"/>
-          <w:sz w:val="22"/>
-          <w:szCs w:val="22"/>
-        </w:rPr>
-        <w:t xml:space="preserve"> </w:t>
-      </w:r>
-      <w:proofErr w:type="spellStart"/>
-      <w:r>
-        <w:rPr>
-          <w:rFonts w:ascii="Bookman Old Style" w:hAnsi="Bookman Old Style"/>
-          <w:sz w:val="22"/>
-          <w:szCs w:val="22"/>
-        </w:rPr>
-        <w:t>tangan</w:t>
-      </w:r>
-      <w:proofErr w:type="spellEnd"/>
-      <w:r>
-        <w:rPr>
-          <w:rFonts w:ascii="Bookman Old Style" w:hAnsi="Bookman Old Style"/>
-          <w:sz w:val="22"/>
-          <w:szCs w:val="22"/>
-        </w:rPr>
-        <w:t xml:space="preserve"> </w:t>
-      </w:r>
-      <w:proofErr w:type="spellStart"/>
-      <w:r>
-        <w:rPr>
-          <w:rFonts w:ascii="Bookman Old Style" w:hAnsi="Bookman Old Style"/>
-          <w:sz w:val="22"/>
-          <w:szCs w:val="22"/>
-        </w:rPr>
-        <w:t>dibawah</w:t>
-      </w:r>
-      <w:proofErr w:type="spellEnd"/>
-      <w:r>
-        <w:rPr>
-          <w:rFonts w:ascii="Bookman Old Style" w:hAnsi="Bookman Old Style"/>
-          <w:sz w:val="22"/>
-          <w:szCs w:val="22"/>
-        </w:rPr>
-        <w:t xml:space="preserve"> </w:t>
-      </w:r>
-      <w:proofErr w:type="spellStart"/>
-      <w:r>
-        <w:rPr>
-          <w:rFonts w:ascii="Bookman Old Style" w:hAnsi="Bookman Old Style"/>
-          <w:sz w:val="22"/>
-          <w:szCs w:val="22"/>
-        </w:rPr>
-        <w:t>ini</w:t>
-      </w:r>
-      <w:proofErr w:type="spellEnd"/>
-      <w:r>
-        <w:rPr>
-          <w:rFonts w:ascii="Bookman Old Style" w:hAnsi="Bookman Old Style"/>
-          <w:sz w:val="22"/>
-          <w:szCs w:val="22"/>
-        </w:rPr>
-        <w:t>:</w:t>
+        <w:t>Yang bertanda tangan dibawah ini:</w:t>
       </w:r>
     </w:p>
     <w:p>
@@ -256,41 +156,13 @@
         <w:tab/>
         <w:t xml:space="preserve">: </w:t>
       </w:r>
-      <w:proofErr w:type="gramStart"/>
-      <w:r>
-        <w:rPr>
-          <w:rFonts w:ascii="Bookman Old Style" w:hAnsi="Bookman Old Style"/>
-          <w:sz w:val="22"/>
-          <w:szCs w:val="22"/>
-        </w:rPr>
-        <w:t xml:space="preserve">{{ </w:t>
-      </w:r>
-      <w:proofErr w:type="spellStart"/>
-      <w:r>
-        <w:rPr>
-          <w:rFonts w:ascii="Bookman Old Style" w:hAnsi="Bookman Old Style"/>
-          <w:sz w:val="22"/>
-          <w:szCs w:val="22"/>
-        </w:rPr>
-        <w:t>nama</w:t>
-      </w:r>
-      <w:proofErr w:type="gramEnd"/>
-      <w:r>
-        <w:rPr>
-          <w:rFonts w:ascii="Bookman Old Style" w:hAnsi="Bookman Old Style"/>
-          <w:sz w:val="22"/>
-          <w:szCs w:val="22"/>
-        </w:rPr>
-        <w:t>_penandatangan</w:t>
-      </w:r>
-      <w:proofErr w:type="spellEnd"/>
-      <w:r>
-        <w:rPr>
-          <w:rFonts w:ascii="Bookman Old Style" w:hAnsi="Bookman Old Style"/>
-          <w:sz w:val="22"/>
-          <w:szCs w:val="22"/>
-        </w:rPr>
-        <w:t xml:space="preserve"> }}</w:t>
+      <w:r>
+        <w:rPr>
+          <w:rFonts w:ascii="Bookman Old Style" w:hAnsi="Bookman Old Style"/>
+          <w:sz w:val="22"/>
+          <w:szCs w:val="22"/>
+        </w:rPr>
+        <w:t>{{ nama_penandatangan }}</w:t>
       </w:r>
     </w:p>
     <w:p>
@@ -304,7 +176,6 @@
           <w:szCs w:val="22"/>
         </w:rPr>
       </w:pPr>
-      <w:proofErr w:type="spellStart"/>
       <w:r>
         <w:rPr>
           <w:rFonts w:ascii="Bookman Old Style" w:hAnsi="Bookman Old Style"/>
@@ -313,7 +184,6 @@
         </w:rPr>
         <w:t>Posisi</w:t>
       </w:r>
-      <w:proofErr w:type="spellEnd"/>
       <w:r>
         <w:rPr>
           <w:rFonts w:ascii="Bookman Old Style" w:hAnsi="Bookman Old Style"/>
@@ -340,41 +210,13 @@
         <w:tab/>
         <w:t xml:space="preserve">: </w:t>
       </w:r>
-      <w:proofErr w:type="gramStart"/>
-      <w:r>
-        <w:rPr>
-          <w:rFonts w:ascii="Bookman Old Style" w:hAnsi="Bookman Old Style"/>
-          <w:sz w:val="22"/>
-          <w:szCs w:val="22"/>
-        </w:rPr>
-        <w:t xml:space="preserve">{{ </w:t>
-      </w:r>
-      <w:proofErr w:type="spellStart"/>
-      <w:r>
-        <w:rPr>
-          <w:rFonts w:ascii="Bookman Old Style" w:hAnsi="Bookman Old Style"/>
-          <w:sz w:val="22"/>
-          <w:szCs w:val="22"/>
-        </w:rPr>
-        <w:t>jabatan</w:t>
-      </w:r>
-      <w:proofErr w:type="gramEnd"/>
-      <w:r>
-        <w:rPr>
-          <w:rFonts w:ascii="Bookman Old Style" w:hAnsi="Bookman Old Style"/>
-          <w:sz w:val="22"/>
-          <w:szCs w:val="22"/>
-        </w:rPr>
-        <w:t>_penandatangan</w:t>
-      </w:r>
-      <w:proofErr w:type="spellEnd"/>
-      <w:r>
-        <w:rPr>
-          <w:rFonts w:ascii="Bookman Old Style" w:hAnsi="Bookman Old Style"/>
-          <w:sz w:val="22"/>
-          <w:szCs w:val="22"/>
-        </w:rPr>
-        <w:t xml:space="preserve"> }}</w:t>
+      <w:r>
+        <w:rPr>
+          <w:rFonts w:ascii="Bookman Old Style" w:hAnsi="Bookman Old Style"/>
+          <w:sz w:val="22"/>
+          <w:szCs w:val="22"/>
+        </w:rPr>
+        <w:t>{{ jabatan_penandatangan }}</w:t>
       </w:r>
     </w:p>
     <w:p>
@@ -403,43 +245,7 @@
           <w:szCs w:val="22"/>
         </w:rPr>
         <w:tab/>
-        <w:t xml:space="preserve">: PT. </w:t>
-      </w:r>
-      <w:proofErr w:type="spellStart"/>
-      <w:r>
-        <w:rPr>
-          <w:rFonts w:ascii="Bookman Old Style" w:hAnsi="Bookman Old Style"/>
-          <w:sz w:val="22"/>
-          <w:szCs w:val="22"/>
-        </w:rPr>
-        <w:t>Orecon</w:t>
-      </w:r>
-      <w:proofErr w:type="spellEnd"/>
-      <w:r>
-        <w:rPr>
-          <w:rFonts w:ascii="Bookman Old Style" w:hAnsi="Bookman Old Style"/>
-          <w:sz w:val="22"/>
-          <w:szCs w:val="22"/>
-        </w:rPr>
-        <w:t xml:space="preserve"> </w:t>
-      </w:r>
-      <w:proofErr w:type="spellStart"/>
-      <w:r>
-        <w:rPr>
-          <w:rFonts w:ascii="Bookman Old Style" w:hAnsi="Bookman Old Style"/>
-          <w:sz w:val="22"/>
-          <w:szCs w:val="22"/>
-        </w:rPr>
-        <w:t>Sadanus</w:t>
-      </w:r>
-      <w:proofErr w:type="spellEnd"/>
-      <w:r>
-        <w:rPr>
-          <w:rFonts w:ascii="Bookman Old Style" w:hAnsi="Bookman Old Style"/>
-          <w:sz w:val="22"/>
-          <w:szCs w:val="22"/>
-        </w:rPr>
-        <w:t xml:space="preserve"> Perkasa</w:t>
+        <w:t>: PT. Orecon Sadanus Perkasa</w:t>
       </w:r>
     </w:p>
     <w:p>
@@ -476,16 +282,7 @@
           <w:szCs w:val="22"/>
         </w:rPr>
         <w:tab/>
-        <w:t xml:space="preserve">: </w:t>
-      </w:r>
-      <w:proofErr w:type="spellStart"/>
-      <w:r>
-        <w:rPr>
-          <w:rFonts w:ascii="Bookman Old Style" w:hAnsi="Bookman Old Style"/>
-          <w:sz w:val="22"/>
-          <w:szCs w:val="22"/>
-        </w:rPr>
-        <w:t>Ruk</w:t>
+        <w:t>: Ruk</w:t>
       </w:r>
       <w:r>
         <w:rPr>
@@ -495,7 +292,6 @@
         </w:rPr>
         <w:t>an</w:t>
       </w:r>
-      <w:proofErr w:type="spellEnd"/>
       <w:r>
         <w:rPr>
           <w:rFonts w:ascii="Bookman Old Style" w:hAnsi="Bookman Old Style"/>
@@ -512,29 +308,7 @@
           <w:sz w:val="22"/>
           <w:szCs w:val="22"/>
         </w:rPr>
-        <w:t xml:space="preserve">Food Plaza </w:t>
-      </w:r>
-      <w:proofErr w:type="spellStart"/>
-      <w:r>
-        <w:rPr>
-          <w:rFonts w:ascii="Bookman Old Style" w:hAnsi="Bookman Old Style"/>
-          <w:i/>
-          <w:iCs/>
-          <w:sz w:val="22"/>
-          <w:szCs w:val="22"/>
-        </w:rPr>
-        <w:t>Cibubur</w:t>
-      </w:r>
-      <w:proofErr w:type="spellEnd"/>
-      <w:r>
-        <w:rPr>
-          <w:rFonts w:ascii="Bookman Old Style" w:hAnsi="Bookman Old Style"/>
-          <w:i/>
-          <w:iCs/>
-          <w:sz w:val="22"/>
-          <w:szCs w:val="22"/>
-        </w:rPr>
-        <w:t xml:space="preserve"> Country</w:t>
+        <w:t>Food Plaza Cibubur Country</w:t>
       </w:r>
       <w:r>
         <w:rPr>
@@ -582,97 +356,15 @@
         <w:tab/>
         <w:t xml:space="preserve">  </w:t>
       </w:r>
-      <w:proofErr w:type="spellStart"/>
-      <w:r>
-        <w:rPr>
-          <w:rFonts w:ascii="Bookman Old Style" w:hAnsi="Bookman Old Style"/>
-          <w:sz w:val="22"/>
-          <w:szCs w:val="22"/>
-          <w:lang w:val="sv-SE"/>
-        </w:rPr>
-        <w:t>Cikeas</w:t>
-      </w:r>
-      <w:proofErr w:type="spellEnd"/>
-      <w:r>
-        <w:rPr>
-          <w:rFonts w:ascii="Bookman Old Style" w:hAnsi="Bookman Old Style"/>
-          <w:sz w:val="22"/>
-          <w:szCs w:val="22"/>
-          <w:lang w:val="sv-SE"/>
-        </w:rPr>
-        <w:t xml:space="preserve"> </w:t>
-      </w:r>
-      <w:proofErr w:type="spellStart"/>
-      <w:r>
-        <w:rPr>
-          <w:rFonts w:ascii="Bookman Old Style" w:hAnsi="Bookman Old Style"/>
-          <w:sz w:val="22"/>
-          <w:szCs w:val="22"/>
-          <w:lang w:val="sv-SE"/>
-        </w:rPr>
-        <w:t>Udik</w:t>
-      </w:r>
-      <w:proofErr w:type="spellEnd"/>
-      <w:r>
-        <w:rPr>
-          <w:rFonts w:ascii="Bookman Old Style" w:hAnsi="Bookman Old Style"/>
-          <w:sz w:val="22"/>
-          <w:szCs w:val="22"/>
-          <w:lang w:val="sv-SE"/>
-        </w:rPr>
-        <w:t xml:space="preserve">, </w:t>
-      </w:r>
-      <w:proofErr w:type="spellStart"/>
-      <w:r>
-        <w:rPr>
-          <w:rFonts w:ascii="Bookman Old Style" w:hAnsi="Bookman Old Style"/>
-          <w:sz w:val="22"/>
-          <w:szCs w:val="22"/>
-          <w:lang w:val="sv-SE"/>
-        </w:rPr>
-        <w:t>Gn</w:t>
-      </w:r>
-      <w:proofErr w:type="spellEnd"/>
-      <w:r>
-        <w:rPr>
-          <w:rFonts w:ascii="Bookman Old Style" w:hAnsi="Bookman Old Style"/>
-          <w:sz w:val="22"/>
-          <w:szCs w:val="22"/>
-          <w:lang w:val="sv-SE"/>
-        </w:rPr>
-        <w:t xml:space="preserve"> </w:t>
-      </w:r>
-      <w:proofErr w:type="spellStart"/>
-      <w:r>
-        <w:rPr>
-          <w:rFonts w:ascii="Bookman Old Style" w:hAnsi="Bookman Old Style"/>
-          <w:sz w:val="22"/>
-          <w:szCs w:val="22"/>
-          <w:lang w:val="sv-SE"/>
-        </w:rPr>
-        <w:t>Putri</w:t>
-      </w:r>
-      <w:proofErr w:type="spellEnd"/>
-      <w:r>
-        <w:rPr>
-          <w:rFonts w:ascii="Bookman Old Style" w:hAnsi="Bookman Old Style"/>
-          <w:sz w:val="22"/>
-          <w:szCs w:val="22"/>
-          <w:lang w:val="sv-SE"/>
-        </w:rPr>
-        <w:t xml:space="preserve"> – Bogor, Jawa Barat </w:t>
-      </w:r>
-      <w:proofErr w:type="gramStart"/>
-      <w:r>
-        <w:rPr>
-          <w:rFonts w:ascii="Bookman Old Style" w:hAnsi="Bookman Old Style"/>
-          <w:sz w:val="22"/>
-          <w:szCs w:val="22"/>
-          <w:lang w:val="sv-SE"/>
-        </w:rPr>
-        <w:t>16966</w:t>
-      </w:r>
-      <w:proofErr w:type="gramEnd"/>
+      <w:r>
+        <w:rPr>
+          <w:rFonts w:ascii="Bookman Old Style" w:hAnsi="Bookman Old Style"/>
+          <w:sz w:val="22"/>
+          <w:szCs w:val="22"/>
+          <w:lang w:val="sv-SE"/>
+        </w:rPr>
+        <w:t>Cikeas Udik, Gn Putri – Bogor, Jawa Barat 16966</w:t>
+      </w:r>
     </w:p>
     <w:p>
       <w:pPr>
@@ -697,7 +389,6 @@
           <w:lang w:val="sv-SE"/>
         </w:rPr>
       </w:pPr>
-      <w:proofErr w:type="spellStart"/>
       <w:r>
         <w:rPr>
           <w:rFonts w:ascii="Bookman Old Style" w:eastAsiaTheme="minorHAnsi" w:hAnsi="Bookman Old Style" w:cs="Bookman Old Style"/>
@@ -706,62 +397,7 @@
           <w:szCs w:val="22"/>
           <w:lang w:val="sv-SE" w:eastAsia="en-ID"/>
         </w:rPr>
-        <w:t>Memberikan</w:t>
-      </w:r>
-      <w:proofErr w:type="spellEnd"/>
-      <w:r>
-        <w:rPr>
-          <w:rFonts w:ascii="Bookman Old Style" w:eastAsiaTheme="minorHAnsi" w:hAnsi="Bookman Old Style" w:cs="Bookman Old Style"/>
-          <w:color w:val="000000"/>
-          <w:sz w:val="22"/>
-          <w:szCs w:val="22"/>
-          <w:lang w:val="sv-SE" w:eastAsia="en-ID"/>
-        </w:rPr>
-        <w:t xml:space="preserve"> </w:t>
-      </w:r>
-      <w:proofErr w:type="spellStart"/>
-      <w:r>
-        <w:rPr>
-          <w:rFonts w:ascii="Bookman Old Style" w:eastAsiaTheme="minorHAnsi" w:hAnsi="Bookman Old Style" w:cs="Bookman Old Style"/>
-          <w:color w:val="000000"/>
-          <w:sz w:val="22"/>
-          <w:szCs w:val="22"/>
-          <w:lang w:val="sv-SE" w:eastAsia="en-ID"/>
-        </w:rPr>
-        <w:t>tugas</w:t>
-      </w:r>
-      <w:proofErr w:type="spellEnd"/>
-      <w:r>
-        <w:rPr>
-          <w:rFonts w:ascii="Bookman Old Style" w:eastAsiaTheme="minorHAnsi" w:hAnsi="Bookman Old Style" w:cs="Bookman Old Style"/>
-          <w:color w:val="000000"/>
-          <w:sz w:val="22"/>
-          <w:szCs w:val="22"/>
-          <w:lang w:val="sv-SE" w:eastAsia="en-ID"/>
-        </w:rPr>
-        <w:t xml:space="preserve"> </w:t>
-      </w:r>
-      <w:proofErr w:type="spellStart"/>
-      <w:r>
-        <w:rPr>
-          <w:rFonts w:ascii="Bookman Old Style" w:eastAsiaTheme="minorHAnsi" w:hAnsi="Bookman Old Style" w:cs="Bookman Old Style"/>
-          <w:color w:val="000000"/>
-          <w:sz w:val="22"/>
-          <w:szCs w:val="22"/>
-          <w:lang w:val="sv-SE" w:eastAsia="en-ID"/>
-        </w:rPr>
-        <w:t>kepada</w:t>
-      </w:r>
-      <w:proofErr w:type="spellEnd"/>
-      <w:r>
-        <w:rPr>
-          <w:rFonts w:ascii="Bookman Old Style" w:eastAsiaTheme="minorHAnsi" w:hAnsi="Bookman Old Style" w:cs="Bookman Old Style"/>
-          <w:color w:val="000000"/>
-          <w:sz w:val="22"/>
-          <w:szCs w:val="22"/>
-          <w:lang w:val="sv-SE" w:eastAsia="en-ID"/>
-        </w:rPr>
-        <w:t>:</w:t>
+        <w:t>Memberikan tugas kepada:</w:t>
       </w:r>
     </w:p>
     <w:p>
@@ -778,7 +414,6 @@
           <w:lang w:val="sv-SE"/>
         </w:rPr>
       </w:pPr>
-      <w:proofErr w:type="spellStart"/>
       <w:r>
         <w:rPr>
           <w:rFonts w:ascii="Bookman Old Style" w:hAnsi="Bookman Old Style"/>
@@ -788,7 +423,6 @@
         </w:rPr>
         <w:t>Nama</w:t>
       </w:r>
-      <w:proofErr w:type="spellEnd"/>
       <w:r>
         <w:rPr>
           <w:rFonts w:ascii="Bookman Old Style" w:hAnsi="Bookman Old Style"/>
@@ -825,7 +459,6 @@
         </w:rPr>
         <w:t xml:space="preserve">: </w:t>
       </w:r>
-      <w:proofErr w:type="gramStart"/>
       <w:r>
         <w:rPr>
           <w:rFonts w:ascii="Bookman Old Style" w:hAnsi="Bookman Old Style"/>
@@ -835,32 +468,7 @@
           <w:szCs w:val="22"/>
           <w:lang w:val="sv-SE"/>
         </w:rPr>
-        <w:t xml:space="preserve">{{ </w:t>
-      </w:r>
-      <w:proofErr w:type="spellStart"/>
-      <w:r>
-        <w:rPr>
-          <w:rFonts w:ascii="Bookman Old Style" w:hAnsi="Bookman Old Style"/>
-          <w:b/>
-          <w:bCs/>
-          <w:sz w:val="22"/>
-          <w:szCs w:val="22"/>
-          <w:lang w:val="sv-SE"/>
-        </w:rPr>
-        <w:t>nama</w:t>
-      </w:r>
-      <w:proofErr w:type="spellEnd"/>
-      <w:proofErr w:type="gramEnd"/>
-      <w:r>
-        <w:rPr>
-          <w:rFonts w:ascii="Bookman Old Style" w:hAnsi="Bookman Old Style"/>
-          <w:b/>
-          <w:bCs/>
-          <w:sz w:val="22"/>
-          <w:szCs w:val="22"/>
-          <w:lang w:val="sv-SE"/>
-        </w:rPr>
-        <w:t xml:space="preserve"> }}</w:t>
+        <w:t>{{ nama }}</w:t>
       </w:r>
     </w:p>
     <w:p>
@@ -877,7 +485,6 @@
           <w:lang w:val="sv-SE"/>
         </w:rPr>
       </w:pPr>
-      <w:proofErr w:type="spellStart"/>
       <w:r>
         <w:rPr>
           <w:rFonts w:ascii="Bookman Old Style" w:hAnsi="Bookman Old Style"/>
@@ -887,7 +494,6 @@
         </w:rPr>
         <w:t>Jabatan</w:t>
       </w:r>
-      <w:proofErr w:type="spellEnd"/>
       <w:r>
         <w:rPr>
           <w:rFonts w:ascii="Bookman Old Style" w:hAnsi="Bookman Old Style"/>
@@ -915,7 +521,6 @@
         </w:rPr>
         <w:t xml:space="preserve">: </w:t>
       </w:r>
-      <w:proofErr w:type="gramStart"/>
       <w:r>
         <w:rPr>
           <w:rFonts w:ascii="Bookman Old Style" w:hAnsi="Bookman Old Style"/>
@@ -925,32 +530,7 @@
           <w:szCs w:val="22"/>
           <w:lang w:val="sv-SE"/>
         </w:rPr>
-        <w:t xml:space="preserve">{{ </w:t>
-      </w:r>
-      <w:proofErr w:type="spellStart"/>
-      <w:r>
-        <w:rPr>
-          <w:rFonts w:ascii="Bookman Old Style" w:hAnsi="Bookman Old Style"/>
-          <w:i/>
-          <w:iCs/>
-          <w:sz w:val="22"/>
-          <w:szCs w:val="22"/>
-          <w:lang w:val="sv-SE"/>
-        </w:rPr>
-        <w:t>jabatan</w:t>
-      </w:r>
-      <w:proofErr w:type="spellEnd"/>
-      <w:proofErr w:type="gramEnd"/>
-      <w:r>
-        <w:rPr>
-          <w:rFonts w:ascii="Bookman Old Style" w:hAnsi="Bookman Old Style"/>
-          <w:i/>
-          <w:iCs/>
-          <w:sz w:val="22"/>
-          <w:szCs w:val="22"/>
-          <w:lang w:val="sv-SE"/>
-        </w:rPr>
-        <w:t xml:space="preserve"> }}</w:t>
+        <w:t>{{ jabatan }}</w:t>
       </w:r>
     </w:p>
     <w:p>
@@ -1010,33 +590,13 @@
         </w:rPr>
         <w:t xml:space="preserve">: </w:t>
       </w:r>
-      <w:proofErr w:type="gramStart"/>
-      <w:r>
-        <w:rPr>
-          <w:rFonts w:ascii="Bookman Old Style" w:hAnsi="Bookman Old Style"/>
-          <w:sz w:val="22"/>
-          <w:szCs w:val="22"/>
-        </w:rPr>
-        <w:t xml:space="preserve">{{ </w:t>
-      </w:r>
-      <w:proofErr w:type="spellStart"/>
-      <w:r>
-        <w:rPr>
-          <w:rFonts w:ascii="Bookman Old Style" w:hAnsi="Bookman Old Style"/>
-          <w:sz w:val="22"/>
-          <w:szCs w:val="22"/>
-        </w:rPr>
-        <w:t>nrp</w:t>
-      </w:r>
-      <w:proofErr w:type="spellEnd"/>
-      <w:proofErr w:type="gramEnd"/>
-      <w:r>
-        <w:rPr>
-          <w:rFonts w:ascii="Bookman Old Style" w:hAnsi="Bookman Old Style"/>
-          <w:sz w:val="22"/>
-          <w:szCs w:val="22"/>
-        </w:rPr>
-        <w:t xml:space="preserve"> }}</w:t>
+      <w:r>
+        <w:rPr>
+          <w:rFonts w:ascii="Bookman Old Style" w:hAnsi="Bookman Old Style"/>
+          <w:sz w:val="22"/>
+          <w:szCs w:val="22"/>
+        </w:rPr>
+        <w:t>{{ nrp }}</w:t>
       </w:r>
     </w:p>
     <w:p>
@@ -1051,7 +611,6 @@
           <w:lang w:val="sv-SE"/>
         </w:rPr>
       </w:pPr>
-      <w:proofErr w:type="spellStart"/>
       <w:r>
         <w:rPr>
           <w:rFonts w:ascii="Bookman Old Style" w:hAnsi="Bookman Old Style"/>
@@ -1061,7 +620,6 @@
         </w:rPr>
         <w:t>Perusahaan</w:t>
       </w:r>
-      <w:proofErr w:type="spellEnd"/>
       <w:r>
         <w:rPr>
           <w:rFonts w:ascii="Bookman Old Style" w:hAnsi="Bookman Old Style"/>
@@ -1087,59 +645,8 @@
           <w:szCs w:val="22"/>
           <w:lang w:val="sv-SE"/>
         </w:rPr>
-        <w:t xml:space="preserve">: PT </w:t>
-      </w:r>
-      <w:proofErr w:type="spellStart"/>
-      <w:r>
-        <w:rPr>
-          <w:rFonts w:ascii="Bookman Old Style" w:hAnsi="Bookman Old Style"/>
-          <w:sz w:val="22"/>
-          <w:szCs w:val="22"/>
-          <w:lang w:val="sv-SE"/>
-        </w:rPr>
-        <w:t>Orecon</w:t>
-      </w:r>
-      <w:proofErr w:type="spellEnd"/>
-      <w:r>
-        <w:rPr>
-          <w:rFonts w:ascii="Bookman Old Style" w:hAnsi="Bookman Old Style"/>
-          <w:sz w:val="22"/>
-          <w:szCs w:val="22"/>
-          <w:lang w:val="sv-SE"/>
-        </w:rPr>
-        <w:t xml:space="preserve"> </w:t>
-      </w:r>
-      <w:proofErr w:type="spellStart"/>
-      <w:r>
-        <w:rPr>
-          <w:rFonts w:ascii="Bookman Old Style" w:hAnsi="Bookman Old Style"/>
-          <w:sz w:val="22"/>
-          <w:szCs w:val="22"/>
-          <w:lang w:val="sv-SE"/>
-        </w:rPr>
-        <w:t>Sadanus</w:t>
-      </w:r>
-      <w:proofErr w:type="spellEnd"/>
-      <w:r>
-        <w:rPr>
-          <w:rFonts w:ascii="Bookman Old Style" w:hAnsi="Bookman Old Style"/>
-          <w:sz w:val="22"/>
-          <w:szCs w:val="22"/>
-          <w:lang w:val="sv-SE"/>
-        </w:rPr>
-        <w:t xml:space="preserve"> </w:t>
-      </w:r>
-      <w:proofErr w:type="spellStart"/>
-      <w:r>
-        <w:rPr>
-          <w:rFonts w:ascii="Bookman Old Style" w:hAnsi="Bookman Old Style"/>
-          <w:sz w:val="22"/>
-          <w:szCs w:val="22"/>
-          <w:lang w:val="sv-SE"/>
-        </w:rPr>
-        <w:t>Perkasa</w:t>
-      </w:r>
-      <w:proofErr w:type="spellEnd"/>
+        <w:t>: PT Orecon Sadanus Perkasa</w:t>
+      </w:r>
     </w:p>
     <w:p>
       <w:pPr>
@@ -1188,7 +695,6 @@
         <w:tab/>
         <w:t xml:space="preserve">: </w:t>
       </w:r>
-      <w:proofErr w:type="gramStart"/>
       <w:r>
         <w:rPr>
           <w:rFonts w:ascii="Bookman Old Style" w:eastAsiaTheme="minorHAnsi" w:hAnsi="Bookman Old Style"/>
@@ -1200,49 +706,7 @@
           <w:szCs w:val="22"/>
           <w:lang w:eastAsia="en-US"/>
         </w:rPr>
-        <w:t xml:space="preserve">{{ </w:t>
-      </w:r>
-      <w:proofErr w:type="spellStart"/>
-      <w:r>
-        <w:rPr>
-          <w:rFonts w:ascii="Bookman Old Style" w:eastAsiaTheme="minorHAnsi" w:hAnsi="Bookman Old Style"/>
-          <w:b/>
-          <w:bCs/>
-          <w:i/>
-          <w:iCs/>
-          <w:sz w:val="22"/>
-          <w:szCs w:val="22"/>
-          <w:lang w:eastAsia="en-US"/>
-        </w:rPr>
-        <w:t>lokasi</w:t>
-      </w:r>
-      <w:proofErr w:type="gramEnd"/>
-      <w:r>
-        <w:rPr>
-          <w:rFonts w:ascii="Bookman Old Style" w:eastAsiaTheme="minorHAnsi" w:hAnsi="Bookman Old Style"/>
-          <w:b/>
-          <w:bCs/>
-          <w:i/>
-          <w:iCs/>
-          <w:sz w:val="22"/>
-          <w:szCs w:val="22"/>
-          <w:lang w:eastAsia="en-US"/>
-        </w:rPr>
-        <w:t>_site</w:t>
-      </w:r>
-      <w:proofErr w:type="spellEnd"/>
-      <w:r>
-        <w:rPr>
-          <w:rFonts w:ascii="Bookman Old Style" w:eastAsiaTheme="minorHAnsi" w:hAnsi="Bookman Old Style"/>
-          <w:b/>
-          <w:bCs/>
-          <w:i/>
-          <w:iCs/>
-          <w:sz w:val="22"/>
-          <w:szCs w:val="22"/>
-          <w:lang w:eastAsia="en-US"/>
-        </w:rPr>
-        <w:t xml:space="preserve"> }}</w:t>
+        <w:t>{{ lokasi_site }}</w:t>
       </w:r>
     </w:p>
     <w:p>
@@ -1257,7 +721,6 @@
           <w:lang w:val="sv-SE" w:eastAsia="en-US"/>
         </w:rPr>
       </w:pPr>
-      <w:proofErr w:type="spellStart"/>
       <w:r>
         <w:rPr>
           <w:rFonts w:ascii="Bookman Old Style" w:hAnsi="Bookman Old Style"/>
@@ -1267,27 +730,15 @@
         </w:rPr>
         <w:t>Tanggal</w:t>
       </w:r>
-      <w:proofErr w:type="spellEnd"/>
-      <w:r>
-        <w:rPr>
-          <w:rFonts w:ascii="Bookman Old Style" w:hAnsi="Bookman Old Style"/>
-          <w:sz w:val="22"/>
-          <w:szCs w:val="22"/>
-          <w:lang w:val="sv-SE"/>
-        </w:rPr>
-        <w:t xml:space="preserve"> </w:t>
-      </w:r>
-      <w:proofErr w:type="spellStart"/>
-      <w:r>
-        <w:rPr>
-          <w:rFonts w:ascii="Bookman Old Style" w:hAnsi="Bookman Old Style"/>
-          <w:sz w:val="22"/>
-          <w:szCs w:val="22"/>
-          <w:lang w:val="sv-SE"/>
-        </w:rPr>
-        <w:t>Berangkat</w:t>
-      </w:r>
-      <w:proofErr w:type="spellEnd"/>
+      <w:r>
+        <w:rPr>
+          <w:rFonts w:ascii="Bookman Old Style" w:hAnsi="Bookman Old Style"/>
+          <w:sz w:val="22"/>
+          <w:szCs w:val="22"/>
+          <w:lang w:val="sv-SE"/>
+        </w:rPr>
+        <w:t xml:space="preserve"> Berangkat</w:t>
+      </w:r>
       <w:r>
         <w:rPr>
           <w:rFonts w:ascii="Bookman Old Style" w:hAnsi="Bookman Old Style"/>
@@ -1298,45 +749,14 @@
         <w:tab/>
         <w:t xml:space="preserve">: </w:t>
       </w:r>
-      <w:proofErr w:type="gramStart"/>
-      <w:r>
-        <w:rPr>
-          <w:rFonts w:ascii="Bookman Old Style" w:hAnsi="Bookman Old Style"/>
-          <w:sz w:val="22"/>
-          <w:szCs w:val="22"/>
-          <w:lang w:val="sv-SE"/>
-        </w:rPr>
-        <w:t xml:space="preserve">{{ </w:t>
-      </w:r>
-      <w:proofErr w:type="spellStart"/>
-      <w:r>
-        <w:rPr>
-          <w:rFonts w:ascii="Bookman Old Style" w:hAnsi="Bookman Old Style"/>
-          <w:sz w:val="22"/>
-          <w:szCs w:val="22"/>
-          <w:lang w:val="sv-SE"/>
-        </w:rPr>
-        <w:t>tanggal</w:t>
-      </w:r>
-      <w:proofErr w:type="gramEnd"/>
-      <w:r>
-        <w:rPr>
-          <w:rFonts w:ascii="Bookman Old Style" w:hAnsi="Bookman Old Style"/>
-          <w:sz w:val="22"/>
-          <w:szCs w:val="22"/>
-          <w:lang w:val="sv-SE"/>
-        </w:rPr>
-        <w:t>_berangkat</w:t>
-      </w:r>
-      <w:proofErr w:type="spellEnd"/>
-      <w:r>
-        <w:rPr>
-          <w:rFonts w:ascii="Bookman Old Style" w:hAnsi="Bookman Old Style"/>
-          <w:sz w:val="22"/>
-          <w:szCs w:val="22"/>
-          <w:lang w:val="sv-SE"/>
-        </w:rPr>
-        <w:t xml:space="preserve"> }}</w:t>
+      <w:r>
+        <w:rPr>
+          <w:rFonts w:ascii="Bookman Old Style" w:hAnsi="Bookman Old Style"/>
+          <w:sz w:val="22"/>
+          <w:szCs w:val="22"/>
+          <w:lang w:val="sv-SE"/>
+        </w:rPr>
+        <w:t>{{ tanggal_berangkat }}</w:t>
       </w:r>
     </w:p>
     <w:p>
@@ -1351,7 +771,6 @@
           <w:lang w:val="sv-SE" w:eastAsia="en-US"/>
         </w:rPr>
       </w:pPr>
-      <w:proofErr w:type="spellStart"/>
       <w:r>
         <w:rPr>
           <w:rFonts w:ascii="Bookman Old Style" w:eastAsiaTheme="minorHAnsi" w:hAnsi="Bookman Old Style"/>
@@ -1359,29 +778,8 @@
           <w:szCs w:val="22"/>
           <w:lang w:val="sv-SE" w:eastAsia="en-US"/>
         </w:rPr>
-        <w:t>Tanggal</w:t>
-      </w:r>
-      <w:proofErr w:type="spellEnd"/>
-      <w:r>
-        <w:rPr>
-          <w:rFonts w:ascii="Bookman Old Style" w:eastAsiaTheme="minorHAnsi" w:hAnsi="Bookman Old Style"/>
-          <w:sz w:val="22"/>
-          <w:szCs w:val="22"/>
-          <w:lang w:val="sv-SE" w:eastAsia="en-US"/>
-        </w:rPr>
-        <w:t xml:space="preserve"> </w:t>
-      </w:r>
-      <w:proofErr w:type="spellStart"/>
-      <w:r>
-        <w:rPr>
-          <w:rFonts w:ascii="Bookman Old Style" w:eastAsiaTheme="minorHAnsi" w:hAnsi="Bookman Old Style"/>
-          <w:sz w:val="22"/>
-          <w:szCs w:val="22"/>
-          <w:lang w:val="sv-SE" w:eastAsia="en-US"/>
-        </w:rPr>
-        <w:t>Kembali</w:t>
-      </w:r>
-      <w:proofErr w:type="spellEnd"/>
+        <w:t>Tanggal Kembali</w:t>
+      </w:r>
       <w:r>
         <w:rPr>
           <w:rFonts w:ascii="Bookman Old Style" w:eastAsiaTheme="minorHAnsi" w:hAnsi="Bookman Old Style"/>
@@ -1392,7 +790,6 @@
         <w:tab/>
         <w:t xml:space="preserve">: </w:t>
       </w:r>
-      <w:proofErr w:type="gramStart"/>
       <w:r>
         <w:rPr>
           <w:rFonts w:ascii="Bookman Old Style" w:eastAsiaTheme="minorHAnsi" w:hAnsi="Bookman Old Style"/>
@@ -1400,37 +797,7 @@
           <w:szCs w:val="22"/>
           <w:lang w:val="sv-SE" w:eastAsia="en-US"/>
         </w:rPr>
-        <w:t xml:space="preserve">{{ </w:t>
-      </w:r>
-      <w:proofErr w:type="spellStart"/>
-      <w:r>
-        <w:rPr>
-          <w:rFonts w:ascii="Bookman Old Style" w:eastAsiaTheme="minorHAnsi" w:hAnsi="Bookman Old Style"/>
-          <w:sz w:val="22"/>
-          <w:szCs w:val="22"/>
-          <w:lang w:val="sv-SE" w:eastAsia="en-US"/>
-        </w:rPr>
-        <w:t>tanggal</w:t>
-      </w:r>
-      <w:proofErr w:type="gramEnd"/>
-      <w:r>
-        <w:rPr>
-          <w:rFonts w:ascii="Bookman Old Style" w:eastAsiaTheme="minorHAnsi" w:hAnsi="Bookman Old Style"/>
-          <w:sz w:val="22"/>
-          <w:szCs w:val="22"/>
-          <w:lang w:val="sv-SE" w:eastAsia="en-US"/>
-        </w:rPr>
-        <w:t>_pulang</w:t>
-      </w:r>
-      <w:proofErr w:type="spellEnd"/>
-      <w:r>
-        <w:rPr>
-          <w:rFonts w:ascii="Bookman Old Style" w:eastAsiaTheme="minorHAnsi" w:hAnsi="Bookman Old Style"/>
-          <w:sz w:val="22"/>
-          <w:szCs w:val="22"/>
-          <w:lang w:val="sv-SE" w:eastAsia="en-US"/>
-        </w:rPr>
-        <w:t xml:space="preserve"> }}</w:t>
+        <w:t>{{ tanggal_pulang }}</w:t>
       </w:r>
     </w:p>
     <w:p>
@@ -1531,7 +898,6 @@
         </w:rPr>
         <w:t xml:space="preserve">, </w:t>
       </w:r>
-      <w:proofErr w:type="gramStart"/>
       <w:r>
         <w:rPr>
           <w:rFonts w:ascii="Bookman Old Style" w:eastAsiaTheme="minorHAnsi" w:hAnsi="Bookman Old Style"/>
@@ -1539,28 +905,7 @@
           <w:szCs w:val="22"/>
           <w:lang w:val="sv-SE" w:eastAsia="en-US"/>
         </w:rPr>
-        <w:t xml:space="preserve">{{ </w:t>
-      </w:r>
-      <w:proofErr w:type="spellStart"/>
-      <w:r>
-        <w:rPr>
-          <w:rFonts w:ascii="Bookman Old Style" w:eastAsiaTheme="minorHAnsi" w:hAnsi="Bookman Old Style"/>
-          <w:sz w:val="22"/>
-          <w:szCs w:val="22"/>
-          <w:lang w:val="sv-SE" w:eastAsia="en-US"/>
-        </w:rPr>
-        <w:t>tanggal</w:t>
-      </w:r>
-      <w:proofErr w:type="spellEnd"/>
-      <w:proofErr w:type="gramEnd"/>
-      <w:r>
-        <w:rPr>
-          <w:rFonts w:ascii="Bookman Old Style" w:eastAsiaTheme="minorHAnsi" w:hAnsi="Bookman Old Style"/>
-          <w:sz w:val="22"/>
-          <w:szCs w:val="22"/>
-          <w:lang w:val="sv-SE" w:eastAsia="en-US"/>
-        </w:rPr>
-        <w:t xml:space="preserve"> }}</w:t>
+        <w:t>{{ tanggal }}</w:t>
       </w:r>
     </w:p>
     <w:p>
@@ -1575,7 +920,6 @@
           <w:lang w:val="sv-SE" w:eastAsia="en-US"/>
         </w:rPr>
       </w:pPr>
-      <w:proofErr w:type="spellStart"/>
       <w:r>
         <w:rPr>
           <w:rFonts w:ascii="Bookman Old Style" w:eastAsiaTheme="minorHAnsi" w:hAnsi="Bookman Old Style"/>
@@ -1583,17 +927,7 @@
           <w:szCs w:val="22"/>
           <w:lang w:val="sv-SE" w:eastAsia="en-US"/>
         </w:rPr>
-        <w:t>Menyetujui</w:t>
-      </w:r>
-      <w:proofErr w:type="spellEnd"/>
-      <w:r>
-        <w:rPr>
-          <w:rFonts w:ascii="Bookman Old Style" w:eastAsiaTheme="minorHAnsi" w:hAnsi="Bookman Old Style"/>
-          <w:sz w:val="22"/>
-          <w:szCs w:val="22"/>
-          <w:lang w:val="sv-SE" w:eastAsia="en-US"/>
-        </w:rPr>
-        <w:t xml:space="preserve">, </w:t>
+        <w:t xml:space="preserve">Menyetujui, </w:t>
       </w:r>
     </w:p>
     <w:p>
@@ -1619,69 +953,8 @@
           <w:szCs w:val="22"/>
           <w:lang w:val="sv-SE" w:eastAsia="en-US"/>
         </w:rPr>
-        <w:t xml:space="preserve">PT. </w:t>
-      </w:r>
-      <w:proofErr w:type="spellStart"/>
-      <w:r>
-        <w:rPr>
-          <w:rFonts w:ascii="Bookman Old Style" w:eastAsiaTheme="minorHAnsi" w:hAnsi="Bookman Old Style"/>
-          <w:b/>
-          <w:bCs/>
-          <w:sz w:val="22"/>
-          <w:szCs w:val="22"/>
-          <w:lang w:val="sv-SE" w:eastAsia="en-US"/>
-        </w:rPr>
-        <w:t>Orecon</w:t>
-      </w:r>
-      <w:proofErr w:type="spellEnd"/>
-      <w:r>
-        <w:rPr>
-          <w:rFonts w:ascii="Bookman Old Style" w:eastAsiaTheme="minorHAnsi" w:hAnsi="Bookman Old Style"/>
-          <w:b/>
-          <w:bCs/>
-          <w:sz w:val="22"/>
-          <w:szCs w:val="22"/>
-          <w:lang w:val="sv-SE" w:eastAsia="en-US"/>
-        </w:rPr>
-        <w:t xml:space="preserve"> </w:t>
-      </w:r>
-      <w:proofErr w:type="spellStart"/>
-      <w:r>
-        <w:rPr>
-          <w:rFonts w:ascii="Bookman Old Style" w:eastAsiaTheme="minorHAnsi" w:hAnsi="Bookman Old Style"/>
-          <w:b/>
-          <w:bCs/>
-          <w:sz w:val="22"/>
-          <w:szCs w:val="22"/>
-          <w:lang w:val="sv-SE" w:eastAsia="en-US"/>
-        </w:rPr>
-        <w:t>Sadanus</w:t>
-      </w:r>
-      <w:proofErr w:type="spellEnd"/>
-      <w:r>
-        <w:rPr>
-          <w:rFonts w:ascii="Bookman Old Style" w:eastAsiaTheme="minorHAnsi" w:hAnsi="Bookman Old Style"/>
-          <w:b/>
-          <w:bCs/>
-          <w:sz w:val="22"/>
-          <w:szCs w:val="22"/>
-          <w:lang w:val="sv-SE" w:eastAsia="en-US"/>
-        </w:rPr>
-        <w:t xml:space="preserve"> </w:t>
-      </w:r>
-      <w:proofErr w:type="spellStart"/>
-      <w:r>
-        <w:rPr>
-          <w:rFonts w:ascii="Bookman Old Style" w:eastAsiaTheme="minorHAnsi" w:hAnsi="Bookman Old Style"/>
-          <w:b/>
-          <w:bCs/>
-          <w:sz w:val="22"/>
-          <w:szCs w:val="22"/>
-          <w:lang w:val="sv-SE" w:eastAsia="en-US"/>
-        </w:rPr>
-        <w:t>Perkasa</w:t>
-      </w:r>
-      <w:proofErr w:type="spellEnd"/>
+        <w:t>PT. Orecon Sadanus Perkasa</w:t>
+      </w:r>
     </w:p>
     <w:p>
       <w:pPr>
@@ -1704,29 +977,7 @@
           <w:szCs w:val="22"/>
           <w:lang w:val="sv-SE" w:eastAsia="en-US"/>
         </w:rPr>
-        <w:t>${</w:t>
-      </w:r>
-      <w:proofErr w:type="spellStart"/>
-      <w:r>
-        <w:rPr>
-          <w:rFonts w:ascii="Bookman Old Style" w:eastAsiaTheme="minorHAnsi" w:hAnsi="Bookman Old Style"/>
-          <w:color w:val="FFFFFF" w:themeColor="background1"/>
-          <w:sz w:val="22"/>
-          <w:szCs w:val="22"/>
-          <w:lang w:val="sv-SE" w:eastAsia="en-US"/>
-        </w:rPr>
-        <w:t>ttd</w:t>
-      </w:r>
-      <w:proofErr w:type="spellEnd"/>
-      <w:r>
-        <w:rPr>
-          <w:rFonts w:ascii="Bookman Old Style" w:eastAsiaTheme="minorHAnsi" w:hAnsi="Bookman Old Style"/>
-          <w:color w:val="FFFFFF" w:themeColor="background1"/>
-          <w:sz w:val="22"/>
-          <w:szCs w:val="22"/>
-          <w:lang w:val="sv-SE" w:eastAsia="en-US"/>
-        </w:rPr>
-        <w:t>}</w:t>
+        <w:t>{{ ttd }}</w:t>
       </w:r>
     </w:p>
     <w:p>
@@ -1736,12 +987,26 @@
         <w:jc w:val="both"/>
         <w:rPr>
           <w:rFonts w:ascii="Bookman Old Style" w:eastAsiaTheme="minorHAnsi" w:hAnsi="Bookman Old Style"/>
-          <w:color w:val="FFFFFF" w:themeColor="background1"/>
-          <w:sz w:val="22"/>
-          <w:szCs w:val="22"/>
-          <w:lang w:val="sv-SE" w:eastAsia="en-US"/>
-        </w:rPr>
-      </w:pPr>
+          <w:b/>
+          <w:bCs/>
+          <w:sz w:val="22"/>
+          <w:szCs w:val="22"/>
+          <w:u w:val="single"/>
+          <w:lang w:eastAsia="en-US"/>
+        </w:rPr>
+      </w:pPr>
+      <w:r>
+        <w:rPr>
+          <w:rFonts w:ascii="Bookman Old Style" w:eastAsiaTheme="minorHAnsi" w:hAnsi="Bookman Old Style"/>
+          <w:b/>
+          <w:bCs/>
+          <w:sz w:val="22"/>
+          <w:szCs w:val="22"/>
+          <w:u w:val="single"/>
+          <w:lang w:eastAsia="en-US"/>
+        </w:rPr>
+        <w:t>{{ nama_penandatangan }}</w:t>
+      </w:r>
     </w:p>
     <w:p>
       <w:pPr>
@@ -1750,103 +1015,21 @@
         <w:jc w:val="both"/>
         <w:rPr>
           <w:rFonts w:ascii="Bookman Old Style" w:eastAsiaTheme="minorHAnsi" w:hAnsi="Bookman Old Style"/>
-          <w:color w:val="FFFFFF" w:themeColor="background1"/>
-          <w:sz w:val="22"/>
-          <w:szCs w:val="22"/>
-          <w:lang w:val="sv-SE" w:eastAsia="en-US"/>
-        </w:rPr>
-      </w:pPr>
-    </w:p>
-    <w:p>
-      <w:pPr>
-        <w:suppressAutoHyphens w:val="0"/>
-        <w:spacing w:after="160" w:line="276" w:lineRule="auto"/>
-        <w:jc w:val="both"/>
-        <w:rPr>
-          <w:rFonts w:ascii="Bookman Old Style" w:eastAsiaTheme="minorHAnsi" w:hAnsi="Bookman Old Style"/>
-          <w:b/>
-          <w:bCs/>
-          <w:sz w:val="22"/>
-          <w:szCs w:val="22"/>
-          <w:u w:val="single"/>
+          <w:sz w:val="22"/>
+          <w:szCs w:val="22"/>
           <w:lang w:eastAsia="en-US"/>
         </w:rPr>
       </w:pPr>
-      <w:proofErr w:type="gramStart"/>
-      <w:r>
-        <w:rPr>
-          <w:rFonts w:ascii="Bookman Old Style" w:eastAsiaTheme="minorHAnsi" w:hAnsi="Bookman Old Style"/>
-          <w:b/>
-          <w:bCs/>
-          <w:sz w:val="22"/>
-          <w:szCs w:val="22"/>
-          <w:u w:val="single"/>
+      <w:r>
+        <w:rPr>
+          <w:rFonts w:ascii="Bookman Old Style" w:eastAsiaTheme="minorHAnsi" w:hAnsi="Bookman Old Style"/>
+          <w:noProof/>
+          <w:sz w:val="22"/>
+          <w:szCs w:val="22"/>
           <w:lang w:eastAsia="en-US"/>
         </w:rPr>
-        <w:t xml:space="preserve">{{ </w:t>
-      </w:r>
-      <w:proofErr w:type="spellStart"/>
-      <w:r>
-        <w:rPr>
-          <w:rFonts w:ascii="Bookman Old Style" w:eastAsiaTheme="minorHAnsi" w:hAnsi="Bookman Old Style"/>
-          <w:b/>
-          <w:bCs/>
-          <w:sz w:val="22"/>
-          <w:szCs w:val="22"/>
-          <w:u w:val="single"/>
-          <w:lang w:eastAsia="en-US"/>
-        </w:rPr>
-        <w:t>nama</w:t>
-      </w:r>
-      <w:proofErr w:type="gramEnd"/>
-      <w:r>
-        <w:rPr>
-          <w:rFonts w:ascii="Bookman Old Style" w:eastAsiaTheme="minorHAnsi" w:hAnsi="Bookman Old Style"/>
-          <w:b/>
-          <w:bCs/>
-          <w:sz w:val="22"/>
-          <w:szCs w:val="22"/>
-          <w:u w:val="single"/>
-          <w:lang w:eastAsia="en-US"/>
-        </w:rPr>
-        <w:t>_penandatangan</w:t>
-      </w:r>
-      <w:proofErr w:type="spellEnd"/>
-      <w:r>
-        <w:rPr>
-          <w:rFonts w:ascii="Bookman Old Style" w:eastAsiaTheme="minorHAnsi" w:hAnsi="Bookman Old Style"/>
-          <w:b/>
-          <w:bCs/>
-          <w:sz w:val="22"/>
-          <w:szCs w:val="22"/>
-          <w:u w:val="single"/>
-          <w:lang w:eastAsia="en-US"/>
-        </w:rPr>
-        <w:t xml:space="preserve"> }}</w:t>
-      </w:r>
-    </w:p>
-    <w:p>
-      <w:pPr>
-        <w:suppressAutoHyphens w:val="0"/>
-        <w:spacing w:after="160" w:line="276" w:lineRule="auto"/>
-        <w:jc w:val="both"/>
-        <w:rPr>
-          <w:rFonts w:ascii="Bookman Old Style" w:eastAsiaTheme="minorHAnsi" w:hAnsi="Bookman Old Style"/>
-          <w:sz w:val="22"/>
-          <w:szCs w:val="22"/>
-          <w:lang w:eastAsia="en-US"/>
-        </w:rPr>
-      </w:pPr>
-      <w:r>
-        <w:rPr>
-          <w:rFonts w:ascii="Bookman Old Style" w:eastAsiaTheme="minorHAnsi" w:hAnsi="Bookman Old Style"/>
-          <w:noProof/>
-          <w:sz w:val="22"/>
-          <w:szCs w:val="22"/>
-          <w:lang w:eastAsia="en-US"/>
-        </w:rPr>
         <w:drawing>
-          <wp:anchor distT="0" distB="0" distL="114300" distR="114300" simplePos="0" relativeHeight="251657216" behindDoc="0" locked="0" layoutInCell="1" allowOverlap="1" wp14:anchorId="4A10D353" wp14:editId="7BAE1E82">
+          <wp:anchor distT="0" distB="0" distL="114300" distR="114300" simplePos="0" relativeHeight="251657216" behindDoc="0" locked="0" layoutInCell="1" allowOverlap="1" wp14:anchorId="4A10D353" wp14:editId="07AD1EA3">
             <wp:simplePos x="0" y="0"/>
             <wp:positionH relativeFrom="column">
               <wp:posOffset>-4393777</wp:posOffset>
@@ -1908,7 +1091,6 @@
           </wp:anchor>
         </w:drawing>
       </w:r>
-      <w:proofErr w:type="gramStart"/>
       <w:r>
         <w:rPr>
           <w:rFonts w:ascii="Bookman Old Style" w:eastAsiaTheme="minorHAnsi" w:hAnsi="Bookman Old Style"/>
@@ -1916,37 +1098,7 @@
           <w:szCs w:val="22"/>
           <w:lang w:eastAsia="en-US"/>
         </w:rPr>
-        <w:t xml:space="preserve">{{ </w:t>
-      </w:r>
-      <w:proofErr w:type="spellStart"/>
-      <w:r>
-        <w:rPr>
-          <w:rFonts w:ascii="Bookman Old Style" w:eastAsiaTheme="minorHAnsi" w:hAnsi="Bookman Old Style"/>
-          <w:sz w:val="22"/>
-          <w:szCs w:val="22"/>
-          <w:lang w:eastAsia="en-US"/>
-        </w:rPr>
-        <w:t>jabatan</w:t>
-      </w:r>
-      <w:proofErr w:type="gramEnd"/>
-      <w:r>
-        <w:rPr>
-          <w:rFonts w:ascii="Bookman Old Style" w:eastAsiaTheme="minorHAnsi" w:hAnsi="Bookman Old Style"/>
-          <w:sz w:val="22"/>
-          <w:szCs w:val="22"/>
-          <w:lang w:eastAsia="en-US"/>
-        </w:rPr>
-        <w:t>_penandatangan</w:t>
-      </w:r>
-      <w:proofErr w:type="spellEnd"/>
-      <w:r>
-        <w:rPr>
-          <w:rFonts w:ascii="Bookman Old Style" w:eastAsiaTheme="minorHAnsi" w:hAnsi="Bookman Old Style"/>
-          <w:sz w:val="22"/>
-          <w:szCs w:val="22"/>
-          <w:lang w:eastAsia="en-US"/>
-        </w:rPr>
-        <w:t xml:space="preserve"> }}</w:t>
+        <w:t>{{ jabatan_penandatangan }}</w:t>
       </w:r>
     </w:p>
     <w:p>
@@ -2023,7 +1175,6 @@
                 <w:lang w:eastAsia="en-US"/>
               </w:rPr>
             </w:pPr>
-            <w:proofErr w:type="gramStart"/>
             <w:r>
               <w:rPr>
                 <w:rFonts w:ascii="Bookman Old Style" w:eastAsiaTheme="minorHAnsi" w:hAnsi="Bookman Old Style"/>
@@ -2032,40 +1183,7 @@
                 <w:szCs w:val="22"/>
                 <w:lang w:eastAsia="en-US"/>
               </w:rPr>
-              <w:t xml:space="preserve">{{ </w:t>
-            </w:r>
-            <w:proofErr w:type="spellStart"/>
-            <w:r>
-              <w:rPr>
-                <w:rFonts w:ascii="Bookman Old Style" w:eastAsiaTheme="minorHAnsi" w:hAnsi="Bookman Old Style"/>
-                <w:color w:val="000000" w:themeColor="text1"/>
-                <w:sz w:val="22"/>
-                <w:szCs w:val="22"/>
-                <w:lang w:eastAsia="en-US"/>
-              </w:rPr>
-              <w:t>foto</w:t>
-            </w:r>
-            <w:proofErr w:type="gramEnd"/>
-            <w:r>
-              <w:rPr>
-                <w:rFonts w:ascii="Bookman Old Style" w:eastAsiaTheme="minorHAnsi" w:hAnsi="Bookman Old Style"/>
-                <w:color w:val="000000" w:themeColor="text1"/>
-                <w:sz w:val="22"/>
-                <w:szCs w:val="22"/>
-                <w:lang w:eastAsia="en-US"/>
-              </w:rPr>
-              <w:t>_ktp</w:t>
-            </w:r>
-            <w:proofErr w:type="spellEnd"/>
-            <w:r>
-              <w:rPr>
-                <w:rFonts w:ascii="Bookman Old Style" w:eastAsiaTheme="minorHAnsi" w:hAnsi="Bookman Old Style"/>
-                <w:color w:val="000000" w:themeColor="text1"/>
-                <w:sz w:val="22"/>
-                <w:szCs w:val="22"/>
-                <w:lang w:eastAsia="en-US"/>
-              </w:rPr>
-              <w:t xml:space="preserve"> }}</w:t>
+              <w:t>{{ foto_ktp }}</w:t>
             </w:r>
           </w:p>
         </w:tc>
@@ -2089,7 +1207,6 @@
                 <w:lang w:eastAsia="en-US"/>
               </w:rPr>
             </w:pPr>
-            <w:proofErr w:type="gramStart"/>
             <w:r>
               <w:rPr>
                 <w:rFonts w:ascii="Bookman Old Style" w:eastAsiaTheme="minorHAnsi" w:hAnsi="Bookman Old Style"/>
@@ -2098,40 +1215,7 @@
                 <w:szCs w:val="22"/>
                 <w:lang w:eastAsia="en-US"/>
               </w:rPr>
-              <w:t xml:space="preserve">{{ </w:t>
-            </w:r>
-            <w:proofErr w:type="spellStart"/>
-            <w:r>
-              <w:rPr>
-                <w:rFonts w:ascii="Bookman Old Style" w:eastAsiaTheme="minorHAnsi" w:hAnsi="Bookman Old Style"/>
-                <w:color w:val="000000" w:themeColor="text1"/>
-                <w:sz w:val="22"/>
-                <w:szCs w:val="22"/>
-                <w:lang w:eastAsia="en-US"/>
-              </w:rPr>
-              <w:t>foto</w:t>
-            </w:r>
-            <w:proofErr w:type="gramEnd"/>
-            <w:r>
-              <w:rPr>
-                <w:rFonts w:ascii="Bookman Old Style" w:eastAsiaTheme="minorHAnsi" w:hAnsi="Bookman Old Style"/>
-                <w:color w:val="000000" w:themeColor="text1"/>
-                <w:sz w:val="22"/>
-                <w:szCs w:val="22"/>
-                <w:lang w:eastAsia="en-US"/>
-              </w:rPr>
-              <w:t>_vaksin</w:t>
-            </w:r>
-            <w:proofErr w:type="spellEnd"/>
-            <w:r>
-              <w:rPr>
-                <w:rFonts w:ascii="Bookman Old Style" w:eastAsiaTheme="minorHAnsi" w:hAnsi="Bookman Old Style"/>
-                <w:color w:val="000000" w:themeColor="text1"/>
-                <w:sz w:val="22"/>
-                <w:szCs w:val="22"/>
-                <w:lang w:eastAsia="en-US"/>
-              </w:rPr>
-              <w:t xml:space="preserve"> }}</w:t>
+              <w:t>{{ foto_vaksin }}</w:t>
             </w:r>
           </w:p>
         </w:tc>
@@ -2468,7 +1552,7 @@
         </mc:Choice>
         <mc:Fallback>
           <w:pict>
-            <v:shape w14:anchorId="2F5A59CC" id="Freeform 20" o:spid="_x0000_s1026" style="position:absolute;margin-left:-102.15pt;margin-top:-147.65pt;width:690.95pt;height:257.55pt;flip:x y;z-index:251661312;visibility:visible;mso-wrap-style:square;mso-wrap-distance-left:9pt;mso-wrap-distance-top:0;mso-wrap-distance-right:9pt;mso-wrap-distance-bottom:0;mso-position-horizontal:absolute;mso-position-horizontal-relative:text;mso-position-vertical:absolute;mso-position-vertical-relative:text;v-text-anchor:top" coordsize="8775315,3270799" o:spt="100" o:gfxdata="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" adj="-11796480,,5400" path="m8775315,3270800l,3270800,,,8775315,r,3270800xe" stroked="f">
+            <v:shape w14:anchorId="2F5A59CC" id="Freeform 20" o:spid="_x0000_s1026" style="position:absolute;margin-left:-102.15pt;margin-top:-147.65pt;width:690.95pt;height:257.55pt;flip:x y;z-index:251661312;visibility:visible;mso-wrap-style:square;mso-wrap-distance-left:9pt;mso-wrap-distance-top:0;mso-wrap-distance-right:9pt;mso-wrap-distance-bottom:0;mso-position-horizontal:absolute;mso-position-horizontal-relative:text;mso-position-vertical:absolute;mso-position-vertical-relative:text;v-text-anchor:top" coordsize="8775315,3270799" o:spt="100" o:gfxdata="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" adj="-11796480,,5400" path="m8775315,3270800l,3270800,,,8775315,r,3270800xe" stroked="f">
               <v:fill r:id="rId3" o:title="" opacity="10486f" recolor="t" rotate="t" type="frame"/>
               <v:stroke joinstyle="miter"/>
               <v:formulas/>

</xml_diff>